<commit_message>
day 7 done. updated Word Doc too? it seemed to be editing a different file for some reason but this should be up to date hopefully
</commit_message>
<xml_diff>
--- a/EmbeddedMiniProject.docx
+++ b/EmbeddedMiniProject.docx
@@ -2787,23 +2787,7 @@
           <w:szCs w:val="48"/>
           <w:lang w:val="en-AU"/>
         </w:rPr>
-        <w:t xml:space="preserve">– </w:t>
-      </w:r>
-      <w:r>
-        <w:rPr>
-          <w:sz w:val="48"/>
-          <w:szCs w:val="48"/>
-          <w:lang w:val="en-AU"/>
-        </w:rPr>
-        <w:t>20</w:t>
-      </w:r>
-      <w:r>
-        <w:rPr>
-          <w:sz w:val="48"/>
-          <w:szCs w:val="48"/>
-          <w:lang w:val="en-AU"/>
-        </w:rPr>
-        <w:t>/06/2026</w:t>
+        <w:t>– 20/06/2026</w:t>
       </w:r>
     </w:p>
     <w:p>
@@ -2837,43 +2821,27 @@
           <w:bCs/>
           <w:lang w:val="en-AU"/>
         </w:rPr>
-        <w:t xml:space="preserve">Input:  </w:t>
-      </w:r>
+        <w:t>Input:  3 Push Buttons</w:t>
+      </w:r>
+    </w:p>
+    <w:p>
+      <w:pPr>
+        <w:pStyle w:val="ListParagraph"/>
+        <w:numPr>
+          <w:ilvl w:val="0"/>
+          <w:numId w:val="2"/>
+        </w:numPr>
+        <w:rPr>
+          <w:lang w:val="en-AU"/>
+        </w:rPr>
+      </w:pPr>
       <w:r>
         <w:rPr>
           <w:b/>
           <w:bCs/>
           <w:lang w:val="en-AU"/>
         </w:rPr>
-        <w:t>3 Push Buttons</w:t>
-      </w:r>
-    </w:p>
-    <w:p>
-      <w:pPr>
-        <w:pStyle w:val="ListParagraph"/>
-        <w:numPr>
-          <w:ilvl w:val="0"/>
-          <w:numId w:val="2"/>
-        </w:numPr>
-        <w:rPr>
-          <w:lang w:val="en-AU"/>
-        </w:rPr>
-      </w:pPr>
-      <w:r>
-        <w:rPr>
-          <w:b/>
-          <w:bCs/>
-          <w:lang w:val="en-AU"/>
-        </w:rPr>
-        <w:t xml:space="preserve">Output: </w:t>
-      </w:r>
-      <w:r>
-        <w:rPr>
-          <w:b/>
-          <w:bCs/>
-          <w:lang w:val="en-AU"/>
-        </w:rPr>
-        <w:t>Buzzer</w:t>
+        <w:t>Output: Buzzer</w:t>
       </w:r>
     </w:p>
     <w:p>
@@ -3442,6 +3410,1242 @@
           <w:lang w:val="en-AU"/>
         </w:rPr>
       </w:pPr>
+    </w:p>
+    <w:p>
+      <w:pPr>
+        <w:pStyle w:val="Heading1"/>
+        <w:rPr>
+          <w:sz w:val="48"/>
+          <w:szCs w:val="48"/>
+        </w:rPr>
+      </w:pPr>
+      <w:r>
+        <w:rPr>
+          <w:sz w:val="48"/>
+          <w:szCs w:val="48"/>
+          <w:lang w:val="en-AU"/>
+        </w:rPr>
+        <w:lastRenderedPageBreak/>
+        <w:t xml:space="preserve">Day </w:t>
+      </w:r>
+      <w:r>
+        <w:rPr>
+          <w:sz w:val="48"/>
+          <w:szCs w:val="48"/>
+          <w:lang w:val="en-AU"/>
+        </w:rPr>
+        <w:t>6 – 21/06/2026</w:t>
+      </w:r>
+    </w:p>
+    <w:p>
+      <w:pPr>
+        <w:pStyle w:val="Heading3"/>
+        <w:rPr>
+          <w:lang w:val="en-AU"/>
+        </w:rPr>
+      </w:pPr>
+      <w:r>
+        <w:rPr>
+          <w:lang w:val="en-AU"/>
+        </w:rPr>
+        <w:t>Wheel Spins</w:t>
+      </w:r>
+    </w:p>
+    <w:p>
+      <w:pPr>
+        <w:pStyle w:val="ListParagraph"/>
+        <w:numPr>
+          <w:ilvl w:val="0"/>
+          <w:numId w:val="2"/>
+        </w:numPr>
+        <w:rPr>
+          <w:lang w:val="en-AU"/>
+        </w:rPr>
+      </w:pPr>
+      <w:r>
+        <w:rPr>
+          <w:b/>
+          <w:bCs/>
+          <w:lang w:val="en-AU"/>
+        </w:rPr>
+        <w:t xml:space="preserve">Input:  Joystick </w:t>
+      </w:r>
+    </w:p>
+    <w:p>
+      <w:pPr>
+        <w:pStyle w:val="ListParagraph"/>
+        <w:numPr>
+          <w:ilvl w:val="0"/>
+          <w:numId w:val="2"/>
+        </w:numPr>
+        <w:rPr>
+          <w:lang w:val="en-AU"/>
+        </w:rPr>
+      </w:pPr>
+      <w:r>
+        <w:rPr>
+          <w:b/>
+          <w:bCs/>
+          <w:lang w:val="en-AU"/>
+        </w:rPr>
+        <w:t>Output: Servo</w:t>
+      </w:r>
+    </w:p>
+    <w:p>
+      <w:pPr>
+        <w:pStyle w:val="ListParagraph"/>
+        <w:numPr>
+          <w:ilvl w:val="0"/>
+          <w:numId w:val="2"/>
+        </w:numPr>
+        <w:rPr>
+          <w:lang w:val="en-AU"/>
+        </w:rPr>
+      </w:pPr>
+      <w:r>
+        <w:rPr>
+          <w:b/>
+          <w:bCs/>
+          <w:lang w:val="en-AU"/>
+        </w:rPr>
+        <w:t xml:space="preserve">Chaos: Cannot repeat jumper wire colour. </w:t>
+      </w:r>
+    </w:p>
+    <w:p>
+      <w:pPr>
+        <w:pStyle w:val="ListParagraph"/>
+        <w:numPr>
+          <w:ilvl w:val="0"/>
+          <w:numId w:val="2"/>
+        </w:numPr>
+        <w:rPr>
+          <w:lang w:val="en-AU"/>
+        </w:rPr>
+      </w:pPr>
+      <w:r>
+        <w:rPr>
+          <w:b/>
+          <w:bCs/>
+          <w:lang w:val="en-AU"/>
+        </w:rPr>
+        <w:t>Evil (if applicable):  N/A.</w:t>
+      </w:r>
+    </w:p>
+    <w:p>
+      <w:pPr>
+        <w:pStyle w:val="Heading3"/>
+        <w:rPr>
+          <w:lang w:val="en-AU"/>
+        </w:rPr>
+      </w:pPr>
+      <w:r>
+        <w:rPr>
+          <w:lang w:val="en-AU"/>
+        </w:rPr>
+        <w:t>Objective</w:t>
+      </w:r>
+    </w:p>
+    <w:p>
+      <w:pPr>
+        <w:pStyle w:val="ListParagraph"/>
+        <w:numPr>
+          <w:ilvl w:val="0"/>
+          <w:numId w:val="2"/>
+        </w:numPr>
+        <w:rPr>
+          <w:lang w:val="en-AU"/>
+        </w:rPr>
+      </w:pPr>
+      <w:r>
+        <w:rPr>
+          <w:lang w:val="en-AU"/>
+        </w:rPr>
+        <w:t xml:space="preserve">Use a servo motor x directions to move a servo motor clockwise and counterclockwise. </w:t>
+      </w:r>
+    </w:p>
+    <w:p>
+      <w:pPr>
+        <w:pStyle w:val="Heading3"/>
+        <w:rPr>
+          <w:lang w:val="en-AU"/>
+        </w:rPr>
+      </w:pPr>
+      <w:r>
+        <w:rPr>
+          <w:lang w:val="en-AU"/>
+        </w:rPr>
+        <w:t>Circuit Diagram and Pin table</w:t>
+      </w:r>
+    </w:p>
+    <w:p>
+      <w:pPr>
+        <w:rPr>
+          <w:lang w:val="en-AU"/>
+        </w:rPr>
+      </w:pPr>
+      <w:r>
+        <w:rPr>
+          <w:lang w:val="en-AU"/>
+        </w:rPr>
+        <w:t xml:space="preserve">Potentiometer </w:t>
+      </w:r>
+    </w:p>
+    <w:tbl>
+      <w:tblPr>
+        <w:tblStyle w:val="TableGrid"/>
+        <w:tblW w:w="0" w:type="auto"/>
+        <w:tblLook w:val="04A0" w:firstRow="1" w:lastRow="0" w:firstColumn="1" w:lastColumn="0" w:noHBand="0" w:noVBand="1"/>
+      </w:tblPr>
+      <w:tblGrid>
+        <w:gridCol w:w="3005"/>
+        <w:gridCol w:w="3005"/>
+        <w:gridCol w:w="3006"/>
+      </w:tblGrid>
+      <w:tr>
+        <w:tc>
+          <w:tcPr>
+            <w:tcW w:w="3005" w:type="dxa"/>
+          </w:tcPr>
+          <w:p>
+            <w:pPr>
+              <w:rPr>
+                <w:lang w:val="en-AU"/>
+              </w:rPr>
+            </w:pPr>
+            <w:r>
+              <w:rPr>
+                <w:lang w:val="en-AU"/>
+              </w:rPr>
+              <w:t>Part</w:t>
+            </w:r>
+          </w:p>
+        </w:tc>
+        <w:tc>
+          <w:tcPr>
+            <w:tcW w:w="3005" w:type="dxa"/>
+          </w:tcPr>
+          <w:p>
+            <w:pPr>
+              <w:rPr>
+                <w:lang w:val="en-AU"/>
+              </w:rPr>
+            </w:pPr>
+            <w:r>
+              <w:rPr>
+                <w:lang w:val="en-AU"/>
+              </w:rPr>
+              <w:t>Pin Num(s)</w:t>
+            </w:r>
+          </w:p>
+        </w:tc>
+        <w:tc>
+          <w:tcPr>
+            <w:tcW w:w="3006" w:type="dxa"/>
+          </w:tcPr>
+          <w:p>
+            <w:pPr>
+              <w:rPr>
+                <w:lang w:val="en-AU"/>
+              </w:rPr>
+            </w:pPr>
+            <w:r>
+              <w:rPr>
+                <w:lang w:val="en-AU"/>
+              </w:rPr>
+              <w:t>Type</w:t>
+            </w:r>
+          </w:p>
+        </w:tc>
+      </w:tr>
+      <w:tr>
+        <w:tc>
+          <w:tcPr>
+            <w:tcW w:w="3005" w:type="dxa"/>
+          </w:tcPr>
+          <w:p>
+            <w:pPr>
+              <w:rPr>
+                <w:lang w:val="en-AU"/>
+              </w:rPr>
+            </w:pPr>
+            <w:r>
+              <w:rPr>
+                <w:lang w:val="en-AU"/>
+              </w:rPr>
+              <w:t>Joystick</w:t>
+            </w:r>
+          </w:p>
+        </w:tc>
+        <w:tc>
+          <w:tcPr>
+            <w:tcW w:w="3005" w:type="dxa"/>
+          </w:tcPr>
+          <w:p>
+            <w:pPr>
+              <w:rPr>
+                <w:lang w:val="en-AU"/>
+              </w:rPr>
+            </w:pPr>
+            <w:r>
+              <w:rPr>
+                <w:lang w:val="en-AU"/>
+              </w:rPr>
+              <w:t xml:space="preserve">GND to GND 5V to 5V, </w:t>
+            </w:r>
+            <w:proofErr w:type="spellStart"/>
+            <w:r>
+              <w:rPr>
+                <w:lang w:val="en-AU"/>
+              </w:rPr>
+              <w:t>VRx</w:t>
+            </w:r>
+            <w:proofErr w:type="spellEnd"/>
+            <w:r>
+              <w:rPr>
+                <w:lang w:val="en-AU"/>
+              </w:rPr>
+              <w:t xml:space="preserve"> to A0. Rest unwired ( no need )</w:t>
+            </w:r>
+          </w:p>
+        </w:tc>
+        <w:tc>
+          <w:tcPr>
+            <w:tcW w:w="3006" w:type="dxa"/>
+          </w:tcPr>
+          <w:p>
+            <w:pPr>
+              <w:rPr>
+                <w:lang w:val="en-AU"/>
+              </w:rPr>
+            </w:pPr>
+            <w:r>
+              <w:rPr>
+                <w:lang w:val="en-AU"/>
+              </w:rPr>
+              <w:t xml:space="preserve">GND is ground, 5V is power, A0 is analog horizontal input from the joystick. </w:t>
+            </w:r>
+          </w:p>
+        </w:tc>
+      </w:tr>
+      <w:tr>
+        <w:tc>
+          <w:tcPr>
+            <w:tcW w:w="3005" w:type="dxa"/>
+          </w:tcPr>
+          <w:p>
+            <w:pPr>
+              <w:rPr>
+                <w:lang w:val="en-AU"/>
+              </w:rPr>
+            </w:pPr>
+            <w:r>
+              <w:rPr>
+                <w:lang w:val="en-AU"/>
+              </w:rPr>
+              <w:t>Servo</w:t>
+            </w:r>
+          </w:p>
+        </w:tc>
+        <w:tc>
+          <w:tcPr>
+            <w:tcW w:w="3005" w:type="dxa"/>
+          </w:tcPr>
+          <w:p>
+            <w:pPr>
+              <w:rPr>
+                <w:lang w:val="en-AU"/>
+              </w:rPr>
+            </w:pPr>
+            <w:r>
+              <w:rPr>
+                <w:lang w:val="en-AU"/>
+              </w:rPr>
+              <w:t xml:space="preserve">GND is GND, 5V is 5V, D9 is signal. </w:t>
+            </w:r>
+          </w:p>
+        </w:tc>
+        <w:tc>
+          <w:tcPr>
+            <w:tcW w:w="3006" w:type="dxa"/>
+          </w:tcPr>
+          <w:p>
+            <w:pPr>
+              <w:rPr>
+                <w:lang w:val="en-AU"/>
+              </w:rPr>
+            </w:pPr>
+            <w:r>
+              <w:rPr>
+                <w:lang w:val="en-AU"/>
+              </w:rPr>
+              <w:t xml:space="preserve">Signal for output on d9, GND for Ground, 5V for power. </w:t>
+            </w:r>
+          </w:p>
+        </w:tc>
+      </w:tr>
+    </w:tbl>
+    <w:p>
+      <w:pPr>
+        <w:rPr>
+          <w:lang w:val="en-AU"/>
+        </w:rPr>
+      </w:pPr>
+    </w:p>
+    <w:p>
+      <w:pPr>
+        <w:pStyle w:val="Heading3"/>
+        <w:rPr>
+          <w:lang w:val="en-AU"/>
+        </w:rPr>
+      </w:pPr>
+      <w:r>
+        <w:rPr>
+          <w:lang w:val="en-AU"/>
+        </w:rPr>
+        <w:t>Code notes</w:t>
+      </w:r>
+    </w:p>
+    <w:p>
+      <w:pPr>
+        <w:pStyle w:val="ListParagraph"/>
+        <w:numPr>
+          <w:ilvl w:val="0"/>
+          <w:numId w:val="2"/>
+        </w:numPr>
+        <w:rPr>
+          <w:lang w:val="en-AU"/>
+        </w:rPr>
+      </w:pPr>
+      <w:r>
+        <w:rPr>
+          <w:lang w:val="en-AU"/>
+        </w:rPr>
+        <w:t xml:space="preserve">Very single code today. </w:t>
+      </w:r>
+    </w:p>
+    <w:p>
+      <w:pPr>
+        <w:pStyle w:val="ListParagraph"/>
+        <w:numPr>
+          <w:ilvl w:val="0"/>
+          <w:numId w:val="2"/>
+        </w:numPr>
+        <w:rPr>
+          <w:lang w:val="en-AU"/>
+        </w:rPr>
+      </w:pPr>
+      <w:r>
+        <w:rPr>
+          <w:lang w:val="en-AU"/>
+        </w:rPr>
+        <w:t xml:space="preserve">Utilise 0 - 1023 analog and map to the range of the servo, then write as the new angle. </w:t>
+      </w:r>
+    </w:p>
+    <w:p>
+      <w:pPr>
+        <w:pStyle w:val="Heading3"/>
+        <w:rPr>
+          <w:lang w:val="en-AU"/>
+        </w:rPr>
+      </w:pPr>
+      <w:r>
+        <w:rPr>
+          <w:lang w:val="en-AU"/>
+        </w:rPr>
+        <w:t>Problems</w:t>
+      </w:r>
+    </w:p>
+    <w:p>
+      <w:pPr>
+        <w:pStyle w:val="ListParagraph"/>
+        <w:numPr>
+          <w:ilvl w:val="0"/>
+          <w:numId w:val="2"/>
+        </w:numPr>
+        <w:rPr>
+          <w:lang w:val="en-AU"/>
+        </w:rPr>
+      </w:pPr>
+      <w:r>
+        <w:rPr>
+          <w:lang w:val="en-AU"/>
+        </w:rPr>
+        <w:t xml:space="preserve">Finding out the 0-1023 was the hardest part. </w:t>
+      </w:r>
+    </w:p>
+    <w:p>
+      <w:pPr>
+        <w:pStyle w:val="ListParagraph"/>
+        <w:numPr>
+          <w:ilvl w:val="0"/>
+          <w:numId w:val="2"/>
+        </w:numPr>
+        <w:rPr>
+          <w:lang w:val="en-AU"/>
+        </w:rPr>
+      </w:pPr>
+      <w:r>
+        <w:rPr>
+          <w:lang w:val="en-AU"/>
+        </w:rPr>
+        <w:t xml:space="preserve">Other than that, simple code. </w:t>
+      </w:r>
+    </w:p>
+    <w:p>
+      <w:pPr>
+        <w:pStyle w:val="Heading3"/>
+        <w:rPr>
+          <w:lang w:val="en-AU"/>
+        </w:rPr>
+      </w:pPr>
+      <w:r>
+        <w:rPr>
+          <w:lang w:val="en-AU"/>
+        </w:rPr>
+        <w:t>Learning</w:t>
+      </w:r>
+    </w:p>
+    <w:p>
+      <w:pPr>
+        <w:pStyle w:val="ListParagraph"/>
+        <w:numPr>
+          <w:ilvl w:val="0"/>
+          <w:numId w:val="2"/>
+        </w:numPr>
+        <w:rPr>
+          <w:lang w:val="en-AU"/>
+        </w:rPr>
+      </w:pPr>
+      <w:r>
+        <w:rPr>
+          <w:lang w:val="en-AU"/>
+        </w:rPr>
+        <w:t xml:space="preserve">Wiring up parts is easier now </w:t>
+      </w:r>
+      <w:proofErr w:type="spellStart"/>
+      <w:r>
+        <w:rPr>
+          <w:lang w:val="en-AU"/>
+        </w:rPr>
+        <w:t>im</w:t>
+      </w:r>
+      <w:proofErr w:type="spellEnd"/>
+      <w:r>
+        <w:rPr>
+          <w:lang w:val="en-AU"/>
+        </w:rPr>
+        <w:t xml:space="preserve"> more used to it, after doing daily activities. </w:t>
+      </w:r>
+    </w:p>
+    <w:p>
+      <w:pPr>
+        <w:pStyle w:val="ListParagraph"/>
+        <w:numPr>
+          <w:ilvl w:val="0"/>
+          <w:numId w:val="2"/>
+        </w:numPr>
+        <w:rPr>
+          <w:lang w:val="en-AU"/>
+        </w:rPr>
+      </w:pPr>
+      <w:r>
+        <w:rPr>
+          <w:lang w:val="en-AU"/>
+        </w:rPr>
+        <w:t xml:space="preserve">Joystick range is between 0 and 1023, and can be mapped on x or y axis, or both. </w:t>
+      </w:r>
+    </w:p>
+    <w:p>
+      <w:pPr>
+        <w:rPr>
+          <w:lang w:val="en-AU"/>
+        </w:rPr>
+      </w:pPr>
+    </w:p>
+    <w:p>
+      <w:pPr>
+        <w:rPr>
+          <w:lang w:val="en-AU"/>
+        </w:rPr>
+      </w:pPr>
+    </w:p>
+    <w:p>
+      <w:pPr>
+        <w:rPr>
+          <w:lang w:val="en-AU"/>
+        </w:rPr>
+      </w:pPr>
+    </w:p>
+    <w:p>
+      <w:pPr>
+        <w:pStyle w:val="Heading1"/>
+        <w:rPr>
+          <w:sz w:val="48"/>
+          <w:szCs w:val="48"/>
+        </w:rPr>
+      </w:pPr>
+      <w:r>
+        <w:rPr>
+          <w:sz w:val="48"/>
+          <w:szCs w:val="48"/>
+          <w:lang w:val="en-AU"/>
+        </w:rPr>
+        <w:lastRenderedPageBreak/>
+        <w:t xml:space="preserve">Day </w:t>
+      </w:r>
+      <w:r>
+        <w:rPr>
+          <w:sz w:val="48"/>
+          <w:szCs w:val="48"/>
+          <w:lang w:val="en-AU"/>
+        </w:rPr>
+        <w:t>7 – 22/06/2026</w:t>
+      </w:r>
+    </w:p>
+    <w:p>
+      <w:pPr>
+        <w:pStyle w:val="Heading3"/>
+        <w:rPr>
+          <w:lang w:val="en-AU"/>
+        </w:rPr>
+      </w:pPr>
+      <w:r>
+        <w:rPr>
+          <w:lang w:val="en-AU"/>
+        </w:rPr>
+        <w:t>Wheel Spins</w:t>
+      </w:r>
+    </w:p>
+    <w:p>
+      <w:pPr>
+        <w:pStyle w:val="ListParagraph"/>
+        <w:numPr>
+          <w:ilvl w:val="0"/>
+          <w:numId w:val="2"/>
+        </w:numPr>
+        <w:rPr>
+          <w:lang w:val="en-AU"/>
+        </w:rPr>
+      </w:pPr>
+      <w:r>
+        <w:rPr>
+          <w:b/>
+          <w:bCs/>
+          <w:lang w:val="en-AU"/>
+        </w:rPr>
+        <w:t>Input:  IR sensor.</w:t>
+      </w:r>
+    </w:p>
+    <w:p>
+      <w:pPr>
+        <w:pStyle w:val="ListParagraph"/>
+        <w:numPr>
+          <w:ilvl w:val="0"/>
+          <w:numId w:val="2"/>
+        </w:numPr>
+        <w:rPr>
+          <w:lang w:val="en-AU"/>
+        </w:rPr>
+      </w:pPr>
+      <w:r>
+        <w:rPr>
+          <w:b/>
+          <w:bCs/>
+          <w:lang w:val="en-AU"/>
+        </w:rPr>
+        <w:t>Output: LED</w:t>
+      </w:r>
+    </w:p>
+    <w:p>
+      <w:pPr>
+        <w:pStyle w:val="ListParagraph"/>
+        <w:numPr>
+          <w:ilvl w:val="0"/>
+          <w:numId w:val="2"/>
+        </w:numPr>
+        <w:rPr>
+          <w:lang w:val="en-AU"/>
+        </w:rPr>
+      </w:pPr>
+      <w:r>
+        <w:rPr>
+          <w:b/>
+          <w:bCs/>
+          <w:lang w:val="en-AU"/>
+        </w:rPr>
+        <w:t xml:space="preserve">Chaos: Have to utilise Relay part. </w:t>
+      </w:r>
+    </w:p>
+    <w:p>
+      <w:pPr>
+        <w:pStyle w:val="ListParagraph"/>
+        <w:numPr>
+          <w:ilvl w:val="0"/>
+          <w:numId w:val="2"/>
+        </w:numPr>
+        <w:rPr>
+          <w:lang w:val="en-AU"/>
+        </w:rPr>
+      </w:pPr>
+      <w:r>
+        <w:rPr>
+          <w:b/>
+          <w:bCs/>
+          <w:lang w:val="en-AU"/>
+        </w:rPr>
+        <w:t>Evil (if applicable):  N/A.</w:t>
+      </w:r>
+    </w:p>
+    <w:p>
+      <w:pPr>
+        <w:pStyle w:val="Heading3"/>
+        <w:rPr>
+          <w:lang w:val="en-AU"/>
+        </w:rPr>
+      </w:pPr>
+      <w:r>
+        <w:rPr>
+          <w:lang w:val="en-AU"/>
+        </w:rPr>
+        <w:t>Objective</w:t>
+      </w:r>
+    </w:p>
+    <w:p>
+      <w:pPr>
+        <w:pStyle w:val="ListParagraph"/>
+        <w:numPr>
+          <w:ilvl w:val="0"/>
+          <w:numId w:val="2"/>
+        </w:numPr>
+        <w:rPr>
+          <w:lang w:val="en-AU"/>
+        </w:rPr>
+      </w:pPr>
+      <w:r>
+        <w:rPr>
+          <w:lang w:val="en-AU"/>
+        </w:rPr>
+        <w:t xml:space="preserve">Make the Light on the board flash when the IR sensor detects motion. </w:t>
+      </w:r>
+    </w:p>
+    <w:p>
+      <w:pPr>
+        <w:pStyle w:val="Heading3"/>
+        <w:rPr>
+          <w:lang w:val="en-AU"/>
+        </w:rPr>
+      </w:pPr>
+      <w:r>
+        <w:rPr>
+          <w:lang w:val="en-AU"/>
+        </w:rPr>
+        <w:t>Circuit Diagram and Pin table</w:t>
+      </w:r>
+    </w:p>
+    <w:p>
+      <w:pPr>
+        <w:rPr>
+          <w:lang w:val="en-AU"/>
+        </w:rPr>
+      </w:pPr>
+      <w:r>
+        <w:rPr>
+          <w:lang w:val="en-AU"/>
+        </w:rPr>
+        <w:t xml:space="preserve">Potentiometer </w:t>
+      </w:r>
+    </w:p>
+    <w:tbl>
+      <w:tblPr>
+        <w:tblStyle w:val="TableGrid"/>
+        <w:tblW w:w="0" w:type="auto"/>
+        <w:tblLook w:val="04A0" w:firstRow="1" w:lastRow="0" w:firstColumn="1" w:lastColumn="0" w:noHBand="0" w:noVBand="1"/>
+      </w:tblPr>
+      <w:tblGrid>
+        <w:gridCol w:w="3005"/>
+        <w:gridCol w:w="3005"/>
+        <w:gridCol w:w="3006"/>
+      </w:tblGrid>
+      <w:tr>
+        <w:tc>
+          <w:tcPr>
+            <w:tcW w:w="3005" w:type="dxa"/>
+          </w:tcPr>
+          <w:p>
+            <w:pPr>
+              <w:rPr>
+                <w:lang w:val="en-AU"/>
+              </w:rPr>
+            </w:pPr>
+            <w:r>
+              <w:rPr>
+                <w:lang w:val="en-AU"/>
+              </w:rPr>
+              <w:t>Part</w:t>
+            </w:r>
+          </w:p>
+        </w:tc>
+        <w:tc>
+          <w:tcPr>
+            <w:tcW w:w="3005" w:type="dxa"/>
+          </w:tcPr>
+          <w:p>
+            <w:pPr>
+              <w:rPr>
+                <w:lang w:val="en-AU"/>
+              </w:rPr>
+            </w:pPr>
+            <w:r>
+              <w:rPr>
+                <w:lang w:val="en-AU"/>
+              </w:rPr>
+              <w:t>Pin Num(s)</w:t>
+            </w:r>
+          </w:p>
+        </w:tc>
+        <w:tc>
+          <w:tcPr>
+            <w:tcW w:w="3006" w:type="dxa"/>
+          </w:tcPr>
+          <w:p>
+            <w:pPr>
+              <w:rPr>
+                <w:lang w:val="en-AU"/>
+              </w:rPr>
+            </w:pPr>
+            <w:r>
+              <w:rPr>
+                <w:lang w:val="en-AU"/>
+              </w:rPr>
+              <w:t>Type</w:t>
+            </w:r>
+          </w:p>
+        </w:tc>
+      </w:tr>
+      <w:tr>
+        <w:tc>
+          <w:tcPr>
+            <w:tcW w:w="3005" w:type="dxa"/>
+          </w:tcPr>
+          <w:p>
+            <w:pPr>
+              <w:rPr>
+                <w:lang w:val="en-AU"/>
+              </w:rPr>
+            </w:pPr>
+            <w:r>
+              <w:t>HC-SR501 IR Sensor</w:t>
+            </w:r>
+          </w:p>
+        </w:tc>
+        <w:tc>
+          <w:tcPr>
+            <w:tcW w:w="3005" w:type="dxa"/>
+          </w:tcPr>
+          <w:p>
+            <w:pPr>
+              <w:rPr>
+                <w:lang w:val="en-AU"/>
+              </w:rPr>
+            </w:pPr>
+            <w:r>
+              <w:t>GND to GND, 5V to 5V, S to D2</w:t>
+            </w:r>
+          </w:p>
+        </w:tc>
+        <w:tc>
+          <w:tcPr>
+            <w:tcW w:w="3006" w:type="dxa"/>
+          </w:tcPr>
+          <w:p>
+            <w:pPr>
+              <w:rPr>
+                <w:lang w:val="en-AU"/>
+              </w:rPr>
+            </w:pPr>
+            <w:r>
+              <w:t>GND is ground, 5V is power, D2 is digital motion signal input</w:t>
+            </w:r>
+          </w:p>
+        </w:tc>
+      </w:tr>
+      <w:tr>
+        <w:tc>
+          <w:tcPr>
+            <w:tcW w:w="3005" w:type="dxa"/>
+          </w:tcPr>
+          <w:p>
+            <w:pPr>
+              <w:rPr>
+                <w:lang w:val="en-AU"/>
+              </w:rPr>
+            </w:pPr>
+            <w:r>
+              <w:rPr>
+                <w:lang w:val="en-AU"/>
+              </w:rPr>
+              <w:t>Relay</w:t>
+            </w:r>
+          </w:p>
+        </w:tc>
+        <w:tc>
+          <w:tcPr>
+            <w:tcW w:w="3005" w:type="dxa"/>
+          </w:tcPr>
+          <w:p>
+            <w:pPr>
+              <w:rPr>
+                <w:lang w:val="en-AU"/>
+              </w:rPr>
+            </w:pPr>
+            <w:r>
+              <w:t>GND to GND, VCC to 5V, IN to D3</w:t>
+            </w:r>
+          </w:p>
+        </w:tc>
+        <w:tc>
+          <w:tcPr>
+            <w:tcW w:w="3006" w:type="dxa"/>
+          </w:tcPr>
+          <w:p>
+            <w:pPr>
+              <w:rPr>
+                <w:lang w:val="en-AU"/>
+              </w:rPr>
+            </w:pPr>
+            <w:r>
+              <w:t>GND is ground, VCC is power, D3 is digital control signal</w:t>
+            </w:r>
+          </w:p>
+        </w:tc>
+      </w:tr>
+      <w:tr>
+        <w:tc>
+          <w:tcPr>
+            <w:tcW w:w="3005" w:type="dxa"/>
+          </w:tcPr>
+          <w:p>
+            <w:pPr>
+              <w:rPr>
+                <w:lang w:val="en-AU"/>
+              </w:rPr>
+            </w:pPr>
+            <w:r>
+              <w:rPr>
+                <w:lang w:val="en-AU"/>
+              </w:rPr>
+              <w:t>LED</w:t>
+            </w:r>
+          </w:p>
+        </w:tc>
+        <w:tc>
+          <w:tcPr>
+            <w:tcW w:w="3005" w:type="dxa"/>
+          </w:tcPr>
+          <w:p>
+            <w:pPr>
+              <w:rPr>
+                <w:lang w:val="en-AU"/>
+              </w:rPr>
+            </w:pPr>
+            <w:r>
+              <w:t>Long leg to NC on relay, short leg to resistor to GND</w:t>
+            </w:r>
+          </w:p>
+        </w:tc>
+        <w:tc>
+          <w:tcPr>
+            <w:tcW w:w="3006" w:type="dxa"/>
+          </w:tcPr>
+          <w:p>
+            <w:pPr>
+              <w:rPr>
+                <w:lang w:val="en-AU"/>
+              </w:rPr>
+            </w:pPr>
+            <w:r>
+              <w:t>resistor to GNDNC is the switched output from relay</w:t>
+            </w:r>
+          </w:p>
+        </w:tc>
+      </w:tr>
+      <w:tr>
+        <w:tc>
+          <w:tcPr>
+            <w:tcW w:w="3005" w:type="dxa"/>
+          </w:tcPr>
+          <w:p>
+            <w:pPr>
+              <w:rPr>
+                <w:lang w:val="en-AU"/>
+              </w:rPr>
+            </w:pPr>
+            <w:r>
+              <w:rPr>
+                <w:lang w:val="en-AU"/>
+              </w:rPr>
+              <w:t>Resistor 220</w:t>
+            </w:r>
+          </w:p>
+        </w:tc>
+        <w:tc>
+          <w:tcPr>
+            <w:tcW w:w="3005" w:type="dxa"/>
+          </w:tcPr>
+          <w:p>
+            <w:pPr>
+              <w:rPr>
+                <w:lang w:val="en-AU"/>
+              </w:rPr>
+            </w:pPr>
+            <w:r>
+              <w:t>Between LED short leg and GND</w:t>
+            </w:r>
+          </w:p>
+        </w:tc>
+        <w:tc>
+          <w:tcPr>
+            <w:tcW w:w="3006" w:type="dxa"/>
+          </w:tcPr>
+          <w:p>
+            <w:pPr>
+              <w:rPr>
+                <w:lang w:val="en-AU"/>
+              </w:rPr>
+            </w:pPr>
+            <w:r>
+              <w:t>Current limiting for LED</w:t>
+            </w:r>
+          </w:p>
+        </w:tc>
+      </w:tr>
+      <w:tr>
+        <w:trPr>
+          <w:trHeight w:val="279"/>
+        </w:trPr>
+        <w:tc>
+          <w:tcPr>
+            <w:tcW w:w="3005" w:type="dxa"/>
+          </w:tcPr>
+          <w:p>
+            <w:pPr>
+              <w:rPr>
+                <w:lang w:val="en-AU"/>
+              </w:rPr>
+            </w:pPr>
+            <w:r>
+              <w:rPr>
+                <w:lang w:val="en-AU"/>
+              </w:rPr>
+              <w:t>Relay COM</w:t>
+            </w:r>
+          </w:p>
+        </w:tc>
+        <w:tc>
+          <w:tcPr>
+            <w:tcW w:w="3005" w:type="dxa"/>
+          </w:tcPr>
+          <w:p>
+            <w:pPr>
+              <w:rPr>
+                <w:lang w:val="en-AU"/>
+              </w:rPr>
+            </w:pPr>
+            <w:r>
+              <w:t>COM to 5V</w:t>
+            </w:r>
+          </w:p>
+        </w:tc>
+        <w:tc>
+          <w:tcPr>
+            <w:tcW w:w="3006" w:type="dxa"/>
+          </w:tcPr>
+          <w:p>
+            <w:pPr>
+              <w:rPr>
+                <w:lang w:val="en-AU"/>
+              </w:rPr>
+            </w:pPr>
+            <w:r>
+              <w:t>Common terminal, provides power to LED circuit</w:t>
+            </w:r>
+          </w:p>
+        </w:tc>
+      </w:tr>
+    </w:tbl>
+    <w:p>
+      <w:pPr>
+        <w:pStyle w:val="Heading3"/>
+        <w:rPr>
+          <w:lang w:val="en-AU"/>
+        </w:rPr>
+      </w:pPr>
+      <w:r>
+        <w:rPr>
+          <w:lang w:val="en-AU"/>
+        </w:rPr>
+        <w:t>Code notes</w:t>
+      </w:r>
+    </w:p>
+    <w:p>
+      <w:pPr>
+        <w:pStyle w:val="ListParagraph"/>
+        <w:numPr>
+          <w:ilvl w:val="0"/>
+          <w:numId w:val="2"/>
+        </w:numPr>
+        <w:rPr>
+          <w:sz w:val="22"/>
+          <w:szCs w:val="22"/>
+          <w:lang w:val="en-AU"/>
+        </w:rPr>
+      </w:pPr>
+      <w:r>
+        <w:rPr>
+          <w:sz w:val="22"/>
+          <w:szCs w:val="22"/>
+          <w:lang w:val="en-AU"/>
+        </w:rPr>
+        <w:t xml:space="preserve">Used flash delay arrays to store the 5 interval values that make the sensor flash faster each time (although it was hard to see) </w:t>
+      </w:r>
+    </w:p>
+    <w:p>
+      <w:pPr>
+        <w:pStyle w:val="ListParagraph"/>
+        <w:numPr>
+          <w:ilvl w:val="0"/>
+          <w:numId w:val="2"/>
+        </w:numPr>
+        <w:rPr>
+          <w:sz w:val="22"/>
+          <w:szCs w:val="22"/>
+          <w:lang w:val="en-AU"/>
+        </w:rPr>
+      </w:pPr>
+      <w:r>
+        <w:rPr>
+          <w:sz w:val="22"/>
+          <w:szCs w:val="22"/>
+          <w:lang w:val="en-AU"/>
+        </w:rPr>
+        <w:t xml:space="preserve">Used Millis so the motion detection was more consistent (as opposed to delay). </w:t>
+      </w:r>
+    </w:p>
+    <w:p>
+      <w:pPr>
+        <w:pStyle w:val="Heading3"/>
+        <w:rPr>
+          <w:lang w:val="en-AU"/>
+        </w:rPr>
+      </w:pPr>
+      <w:r>
+        <w:rPr>
+          <w:lang w:val="en-AU"/>
+        </w:rPr>
+        <w:t>Problems</w:t>
+      </w:r>
+    </w:p>
+    <w:p>
+      <w:pPr>
+        <w:pStyle w:val="ListParagraph"/>
+        <w:numPr>
+          <w:ilvl w:val="0"/>
+          <w:numId w:val="2"/>
+        </w:numPr>
+        <w:rPr>
+          <w:sz w:val="22"/>
+          <w:szCs w:val="22"/>
+          <w:lang w:val="en-AU"/>
+        </w:rPr>
+      </w:pPr>
+      <w:r>
+        <w:rPr>
+          <w:sz w:val="22"/>
+          <w:szCs w:val="22"/>
+          <w:lang w:val="en-AU"/>
+        </w:rPr>
+        <w:t xml:space="preserve">Adjusting IR sensor sensitivity was finnicky. </w:t>
+      </w:r>
+    </w:p>
+    <w:p>
+      <w:pPr>
+        <w:pStyle w:val="ListParagraph"/>
+        <w:numPr>
+          <w:ilvl w:val="0"/>
+          <w:numId w:val="2"/>
+        </w:numPr>
+        <w:rPr>
+          <w:sz w:val="22"/>
+          <w:szCs w:val="22"/>
+          <w:lang w:val="en-AU"/>
+        </w:rPr>
+      </w:pPr>
+      <w:r>
+        <w:rPr>
+          <w:sz w:val="22"/>
+          <w:szCs w:val="22"/>
+          <w:lang w:val="en-AU"/>
+        </w:rPr>
+        <w:t xml:space="preserve">In built trigger delay on the IR sensor was a pain to be adjusted.  </w:t>
+      </w:r>
+    </w:p>
+    <w:p>
+      <w:pPr>
+        <w:pStyle w:val="Heading3"/>
+        <w:rPr>
+          <w:lang w:val="en-AU"/>
+        </w:rPr>
+      </w:pPr>
+      <w:r>
+        <w:rPr>
+          <w:lang w:val="en-AU"/>
+        </w:rPr>
+        <w:t>Learning</w:t>
+      </w:r>
+    </w:p>
+    <w:p>
+      <w:pPr>
+        <w:pStyle w:val="ListParagraph"/>
+        <w:numPr>
+          <w:ilvl w:val="0"/>
+          <w:numId w:val="2"/>
+        </w:numPr>
+        <w:rPr>
+          <w:sz w:val="22"/>
+          <w:szCs w:val="22"/>
+          <w:lang w:val="en-AU"/>
+        </w:rPr>
+      </w:pPr>
+      <w:r>
+        <w:rPr>
+          <w:sz w:val="22"/>
+          <w:szCs w:val="22"/>
+          <w:lang w:val="en-AU"/>
+        </w:rPr>
+        <w:t xml:space="preserve">I understand how an IR sensor works and how to adjust its values. </w:t>
+      </w:r>
+    </w:p>
+    <w:p>
+      <w:pPr>
+        <w:pStyle w:val="ListParagraph"/>
+        <w:numPr>
+          <w:ilvl w:val="0"/>
+          <w:numId w:val="2"/>
+        </w:numPr>
+        <w:rPr>
+          <w:sz w:val="22"/>
+          <w:szCs w:val="22"/>
+          <w:lang w:val="en-AU"/>
+        </w:rPr>
+      </w:pPr>
+      <w:r>
+        <w:rPr>
+          <w:sz w:val="22"/>
+          <w:szCs w:val="22"/>
+          <w:lang w:val="en-AU"/>
+        </w:rPr>
+        <w:t>I used a relay for the first time, and I understand why you’d use it, since they act as sort of voltage switches that allow the Arduino to access more complex components that would short it otherwise.</w:t>
+      </w:r>
     </w:p>
     <w:p>
       <w:pPr>

</xml_diff>

<commit_message>
Day 008 completed! 3 Note piano Done!
</commit_message>
<xml_diff>
--- a/EmbeddedMiniProject.docx
+++ b/EmbeddedMiniProject.docx
@@ -4662,6 +4662,781 @@
           <w:lang w:val="en-AU"/>
         </w:rPr>
         <w:lastRenderedPageBreak/>
+        <w:t xml:space="preserve">Day </w:t>
+      </w:r>
+      <w:r>
+        <w:rPr>
+          <w:sz w:val="48"/>
+          <w:szCs w:val="48"/>
+          <w:lang w:val="en-AU"/>
+        </w:rPr>
+        <w:t>8 -</w:t>
+      </w:r>
+      <w:r>
+        <w:rPr>
+          <w:sz w:val="48"/>
+          <w:szCs w:val="48"/>
+          <w:lang w:val="en-AU"/>
+        </w:rPr>
+        <w:t xml:space="preserve">  </w:t>
+      </w:r>
+      <w:r>
+        <w:rPr>
+          <w:sz w:val="48"/>
+          <w:szCs w:val="48"/>
+          <w:lang w:val="en-AU"/>
+        </w:rPr>
+        <w:t>23</w:t>
+      </w:r>
+      <w:r>
+        <w:rPr>
+          <w:sz w:val="48"/>
+          <w:szCs w:val="48"/>
+          <w:lang w:val="en-AU"/>
+        </w:rPr>
+        <w:t>/</w:t>
+      </w:r>
+      <w:r>
+        <w:rPr>
+          <w:sz w:val="48"/>
+          <w:szCs w:val="48"/>
+          <w:lang w:val="en-AU"/>
+        </w:rPr>
+        <w:t>06</w:t>
+      </w:r>
+      <w:r>
+        <w:rPr>
+          <w:sz w:val="48"/>
+          <w:szCs w:val="48"/>
+          <w:lang w:val="en-AU"/>
+        </w:rPr>
+        <w:t>/2026</w:t>
+      </w:r>
+    </w:p>
+    <w:p>
+      <w:pPr>
+        <w:pStyle w:val="Heading3"/>
+        <w:rPr>
+          <w:lang w:val="en-AU"/>
+        </w:rPr>
+      </w:pPr>
+      <w:r>
+        <w:rPr>
+          <w:lang w:val="en-AU"/>
+        </w:rPr>
+        <w:t>Wheel Spins</w:t>
+      </w:r>
+    </w:p>
+    <w:p>
+      <w:pPr>
+        <w:pStyle w:val="ListParagraph"/>
+        <w:numPr>
+          <w:ilvl w:val="0"/>
+          <w:numId w:val="2"/>
+        </w:numPr>
+        <w:rPr>
+          <w:lang w:val="en-AU"/>
+        </w:rPr>
+      </w:pPr>
+      <w:r>
+        <w:rPr>
+          <w:b/>
+          <w:bCs/>
+          <w:lang w:val="en-AU"/>
+        </w:rPr>
+        <w:t>Input:</w:t>
+      </w:r>
+      <w:r>
+        <w:rPr>
+          <w:b/>
+          <w:bCs/>
+          <w:lang w:val="en-AU"/>
+        </w:rPr>
+        <w:t xml:space="preserve"> 3 Buttons</w:t>
+      </w:r>
+    </w:p>
+    <w:p>
+      <w:pPr>
+        <w:pStyle w:val="ListParagraph"/>
+        <w:numPr>
+          <w:ilvl w:val="0"/>
+          <w:numId w:val="2"/>
+        </w:numPr>
+        <w:rPr>
+          <w:lang w:val="en-AU"/>
+        </w:rPr>
+      </w:pPr>
+      <w:r>
+        <w:rPr>
+          <w:b/>
+          <w:bCs/>
+          <w:lang w:val="en-AU"/>
+        </w:rPr>
+        <w:t>Output:</w:t>
+      </w:r>
+      <w:r>
+        <w:rPr>
+          <w:b/>
+          <w:bCs/>
+          <w:lang w:val="en-AU"/>
+        </w:rPr>
+        <w:t xml:space="preserve"> Speaker</w:t>
+      </w:r>
+    </w:p>
+    <w:p>
+      <w:pPr>
+        <w:pStyle w:val="ListParagraph"/>
+        <w:numPr>
+          <w:ilvl w:val="0"/>
+          <w:numId w:val="2"/>
+        </w:numPr>
+        <w:rPr>
+          <w:lang w:val="en-AU"/>
+        </w:rPr>
+      </w:pPr>
+      <w:r>
+        <w:rPr>
+          <w:b/>
+          <w:bCs/>
+          <w:lang w:val="en-AU"/>
+        </w:rPr>
+        <w:t>Chaos:</w:t>
+      </w:r>
+      <w:r>
+        <w:rPr>
+          <w:b/>
+          <w:bCs/>
+          <w:lang w:val="en-AU"/>
+        </w:rPr>
+        <w:t xml:space="preserve"> Can only upload ONCE</w:t>
+      </w:r>
+    </w:p>
+    <w:p>
+      <w:pPr>
+        <w:pStyle w:val="ListParagraph"/>
+        <w:numPr>
+          <w:ilvl w:val="0"/>
+          <w:numId w:val="2"/>
+        </w:numPr>
+        <w:rPr>
+          <w:lang w:val="en-AU"/>
+        </w:rPr>
+      </w:pPr>
+      <w:r>
+        <w:rPr>
+          <w:b/>
+          <w:bCs/>
+          <w:lang w:val="en-AU"/>
+        </w:rPr>
+        <w:t>Evil (if applicable):</w:t>
+      </w:r>
+      <w:r>
+        <w:rPr>
+          <w:b/>
+          <w:bCs/>
+          <w:lang w:val="en-AU"/>
+        </w:rPr>
+        <w:t xml:space="preserve"> N/A</w:t>
+      </w:r>
+    </w:p>
+    <w:p>
+      <w:pPr>
+        <w:pStyle w:val="Heading3"/>
+        <w:rPr>
+          <w:lang w:val="en-AU"/>
+        </w:rPr>
+      </w:pPr>
+      <w:r>
+        <w:rPr>
+          <w:lang w:val="en-AU"/>
+        </w:rPr>
+        <w:t>Objective</w:t>
+      </w:r>
+    </w:p>
+    <w:p>
+      <w:pPr>
+        <w:rPr>
+          <w:lang w:val="en-AU"/>
+        </w:rPr>
+      </w:pPr>
+      <w:r>
+        <w:rPr>
+          <w:lang w:val="en-AU"/>
+        </w:rPr>
+        <w:t xml:space="preserve">Make a speaker that plays C,E and G tones. </w:t>
+      </w:r>
+    </w:p>
+    <w:p>
+      <w:pPr>
+        <w:pStyle w:val="Heading3"/>
+        <w:rPr>
+          <w:lang w:val="en-AU"/>
+        </w:rPr>
+      </w:pPr>
+      <w:r>
+        <w:rPr>
+          <w:lang w:val="en-AU"/>
+        </w:rPr>
+        <w:t>Circuit Diagram and Pin table</w:t>
+      </w:r>
+    </w:p>
+    <w:tbl>
+      <w:tblPr>
+        <w:tblStyle w:val="TableGrid"/>
+        <w:tblW w:w="0" w:type="auto"/>
+        <w:tblLook w:val="04A0" w:firstRow="1" w:lastRow="0" w:firstColumn="1" w:lastColumn="0" w:noHBand="0" w:noVBand="1"/>
+      </w:tblPr>
+      <w:tblGrid>
+        <w:gridCol w:w="3005"/>
+        <w:gridCol w:w="3005"/>
+        <w:gridCol w:w="3006"/>
+      </w:tblGrid>
+      <w:tr>
+        <w:tc>
+          <w:tcPr>
+            <w:tcW w:w="3005" w:type="dxa"/>
+          </w:tcPr>
+          <w:p>
+            <w:pPr>
+              <w:rPr>
+                <w:lang w:val="en-AU"/>
+              </w:rPr>
+            </w:pPr>
+            <w:r>
+              <w:rPr>
+                <w:lang w:val="en-AU"/>
+              </w:rPr>
+              <w:t>Part</w:t>
+            </w:r>
+          </w:p>
+        </w:tc>
+        <w:tc>
+          <w:tcPr>
+            <w:tcW w:w="3005" w:type="dxa"/>
+          </w:tcPr>
+          <w:p>
+            <w:pPr>
+              <w:rPr>
+                <w:lang w:val="en-AU"/>
+              </w:rPr>
+            </w:pPr>
+            <w:r>
+              <w:rPr>
+                <w:lang w:val="en-AU"/>
+              </w:rPr>
+              <w:t>Pin Num</w:t>
+            </w:r>
+          </w:p>
+        </w:tc>
+        <w:tc>
+          <w:tcPr>
+            <w:tcW w:w="3006" w:type="dxa"/>
+          </w:tcPr>
+          <w:p>
+            <w:pPr>
+              <w:rPr>
+                <w:lang w:val="en-AU"/>
+              </w:rPr>
+            </w:pPr>
+            <w:r>
+              <w:rPr>
+                <w:lang w:val="en-AU"/>
+              </w:rPr>
+              <w:t>Type</w:t>
+            </w:r>
+          </w:p>
+        </w:tc>
+      </w:tr>
+      <w:tr>
+        <w:tc>
+          <w:tcPr>
+            <w:tcW w:w="3005" w:type="dxa"/>
+          </w:tcPr>
+          <w:p>
+            <w:pPr>
+              <w:rPr>
+                <w:lang w:val="en-AU"/>
+              </w:rPr>
+            </w:pPr>
+            <w:r>
+              <w:rPr>
+                <w:lang w:val="en-AU"/>
+              </w:rPr>
+              <w:t xml:space="preserve">Speaker </w:t>
+            </w:r>
+          </w:p>
+        </w:tc>
+        <w:tc>
+          <w:tcPr>
+            <w:tcW w:w="3005" w:type="dxa"/>
+          </w:tcPr>
+          <w:p>
+            <w:pPr>
+              <w:rPr>
+                <w:lang w:val="en-AU"/>
+              </w:rPr>
+            </w:pPr>
+            <w:r>
+              <w:rPr>
+                <w:lang w:val="en-AU"/>
+              </w:rPr>
+              <w:t>+ to D9, GND to GND</w:t>
+            </w:r>
+          </w:p>
+        </w:tc>
+        <w:tc>
+          <w:tcPr>
+            <w:tcW w:w="3006" w:type="dxa"/>
+          </w:tcPr>
+          <w:p>
+            <w:pPr>
+              <w:rPr>
+                <w:lang w:val="en-AU"/>
+              </w:rPr>
+            </w:pPr>
+            <w:r>
+              <w:rPr>
+                <w:lang w:val="en-AU"/>
+              </w:rPr>
+              <w:t>D9 is audio signal, GND is GND</w:t>
+            </w:r>
+          </w:p>
+        </w:tc>
+      </w:tr>
+      <w:tr>
+        <w:tc>
+          <w:tcPr>
+            <w:tcW w:w="3005" w:type="dxa"/>
+          </w:tcPr>
+          <w:p>
+            <w:pPr>
+              <w:rPr>
+                <w:lang w:val="en-AU"/>
+              </w:rPr>
+            </w:pPr>
+            <w:r>
+              <w:rPr>
+                <w:lang w:val="en-AU"/>
+              </w:rPr>
+              <w:t>C button</w:t>
+            </w:r>
+          </w:p>
+        </w:tc>
+        <w:tc>
+          <w:tcPr>
+            <w:tcW w:w="3005" w:type="dxa"/>
+          </w:tcPr>
+          <w:p>
+            <w:pPr>
+              <w:rPr>
+                <w:lang w:val="en-AU"/>
+              </w:rPr>
+            </w:pPr>
+            <w:r>
+              <w:rPr>
+                <w:lang w:val="en-AU"/>
+              </w:rPr>
+              <w:t>Left to D2, Right to GND</w:t>
+            </w:r>
+          </w:p>
+        </w:tc>
+        <w:tc>
+          <w:tcPr>
+            <w:tcW w:w="3006" w:type="dxa"/>
+          </w:tcPr>
+          <w:p>
+            <w:pPr>
+              <w:rPr>
+                <w:lang w:val="en-AU"/>
+              </w:rPr>
+            </w:pPr>
+            <w:r>
+              <w:rPr>
+                <w:lang w:val="en-AU"/>
+              </w:rPr>
+              <w:t xml:space="preserve">D2 is input signal, right is GND. </w:t>
+            </w:r>
+          </w:p>
+        </w:tc>
+      </w:tr>
+      <w:tr>
+        <w:tc>
+          <w:tcPr>
+            <w:tcW w:w="3005" w:type="dxa"/>
+          </w:tcPr>
+          <w:p>
+            <w:pPr>
+              <w:rPr>
+                <w:lang w:val="en-AU"/>
+              </w:rPr>
+            </w:pPr>
+            <w:r>
+              <w:rPr>
+                <w:lang w:val="en-AU"/>
+              </w:rPr>
+              <w:t>E button</w:t>
+            </w:r>
+          </w:p>
+        </w:tc>
+        <w:tc>
+          <w:tcPr>
+            <w:tcW w:w="3005" w:type="dxa"/>
+          </w:tcPr>
+          <w:p>
+            <w:pPr>
+              <w:rPr>
+                <w:lang w:val="en-AU"/>
+              </w:rPr>
+            </w:pPr>
+            <w:r>
+              <w:rPr>
+                <w:lang w:val="en-AU"/>
+              </w:rPr>
+              <w:t>Left to D</w:t>
+            </w:r>
+            <w:r>
+              <w:rPr>
+                <w:lang w:val="en-AU"/>
+              </w:rPr>
+              <w:t>3</w:t>
+            </w:r>
+            <w:r>
+              <w:rPr>
+                <w:lang w:val="en-AU"/>
+              </w:rPr>
+              <w:t>, Right to GND</w:t>
+            </w:r>
+          </w:p>
+        </w:tc>
+        <w:tc>
+          <w:tcPr>
+            <w:tcW w:w="3006" w:type="dxa"/>
+          </w:tcPr>
+          <w:p>
+            <w:pPr>
+              <w:rPr>
+                <w:lang w:val="en-AU"/>
+              </w:rPr>
+            </w:pPr>
+            <w:r>
+              <w:rPr>
+                <w:lang w:val="en-AU"/>
+              </w:rPr>
+              <w:t>D</w:t>
+            </w:r>
+            <w:r>
+              <w:rPr>
+                <w:lang w:val="en-AU"/>
+              </w:rPr>
+              <w:t>3</w:t>
+            </w:r>
+            <w:r>
+              <w:rPr>
+                <w:lang w:val="en-AU"/>
+              </w:rPr>
+              <w:t xml:space="preserve"> is input signal, right is GND. </w:t>
+            </w:r>
+          </w:p>
+        </w:tc>
+      </w:tr>
+      <w:tr>
+        <w:tc>
+          <w:tcPr>
+            <w:tcW w:w="3005" w:type="dxa"/>
+          </w:tcPr>
+          <w:p>
+            <w:pPr>
+              <w:rPr>
+                <w:lang w:val="en-AU"/>
+              </w:rPr>
+            </w:pPr>
+            <w:r>
+              <w:rPr>
+                <w:lang w:val="en-AU"/>
+              </w:rPr>
+              <w:t>G button</w:t>
+            </w:r>
+          </w:p>
+        </w:tc>
+        <w:tc>
+          <w:tcPr>
+            <w:tcW w:w="3005" w:type="dxa"/>
+          </w:tcPr>
+          <w:p>
+            <w:pPr>
+              <w:rPr>
+                <w:lang w:val="en-AU"/>
+              </w:rPr>
+            </w:pPr>
+            <w:r>
+              <w:rPr>
+                <w:lang w:val="en-AU"/>
+              </w:rPr>
+              <w:t>Left to D</w:t>
+            </w:r>
+            <w:r>
+              <w:rPr>
+                <w:lang w:val="en-AU"/>
+              </w:rPr>
+              <w:t>4</w:t>
+            </w:r>
+            <w:r>
+              <w:rPr>
+                <w:lang w:val="en-AU"/>
+              </w:rPr>
+              <w:t>, Right to GND</w:t>
+            </w:r>
+          </w:p>
+        </w:tc>
+        <w:tc>
+          <w:tcPr>
+            <w:tcW w:w="3006" w:type="dxa"/>
+          </w:tcPr>
+          <w:p>
+            <w:pPr>
+              <w:rPr>
+                <w:lang w:val="en-AU"/>
+              </w:rPr>
+            </w:pPr>
+            <w:r>
+              <w:rPr>
+                <w:lang w:val="en-AU"/>
+              </w:rPr>
+              <w:t>D</w:t>
+            </w:r>
+            <w:r>
+              <w:rPr>
+                <w:lang w:val="en-AU"/>
+              </w:rPr>
+              <w:t>4</w:t>
+            </w:r>
+            <w:r>
+              <w:rPr>
+                <w:lang w:val="en-AU"/>
+              </w:rPr>
+              <w:t xml:space="preserve"> is input signal, right is GND. </w:t>
+            </w:r>
+          </w:p>
+        </w:tc>
+      </w:tr>
+    </w:tbl>
+    <w:p>
+      <w:pPr>
+        <w:rPr>
+          <w:lang w:val="en-AU"/>
+        </w:rPr>
+      </w:pPr>
+    </w:p>
+    <w:p>
+      <w:pPr>
+        <w:pStyle w:val="Heading3"/>
+        <w:rPr>
+          <w:lang w:val="en-AU"/>
+        </w:rPr>
+      </w:pPr>
+      <w:r>
+        <w:rPr>
+          <w:lang w:val="en-AU"/>
+        </w:rPr>
+        <w:t>Code notes</w:t>
+      </w:r>
+    </w:p>
+    <w:p>
+      <w:pPr>
+        <w:pStyle w:val="ListParagraph"/>
+        <w:numPr>
+          <w:ilvl w:val="0"/>
+          <w:numId w:val="2"/>
+        </w:numPr>
+        <w:rPr>
+          <w:lang w:val="en-AU"/>
+        </w:rPr>
+      </w:pPr>
+      <w:r>
+        <w:rPr>
+          <w:lang w:val="en-AU"/>
+        </w:rPr>
+        <w:t xml:space="preserve">Define note values (look up values for notes online. No room for troubleshooting as I can only upload ONCE. </w:t>
+      </w:r>
+    </w:p>
+    <w:p>
+      <w:pPr>
+        <w:pStyle w:val="ListParagraph"/>
+        <w:numPr>
+          <w:ilvl w:val="0"/>
+          <w:numId w:val="2"/>
+        </w:numPr>
+        <w:rPr>
+          <w:lang w:val="en-AU"/>
+        </w:rPr>
+      </w:pPr>
+      <w:r>
+        <w:rPr>
+          <w:lang w:val="en-AU"/>
+        </w:rPr>
+        <w:t xml:space="preserve">Simple if else if function to make it play notes. </w:t>
+      </w:r>
+    </w:p>
+    <w:p>
+      <w:pPr>
+        <w:pStyle w:val="Heading3"/>
+        <w:rPr>
+          <w:lang w:val="en-AU"/>
+        </w:rPr>
+      </w:pPr>
+      <w:r>
+        <w:rPr>
+          <w:lang w:val="en-AU"/>
+        </w:rPr>
+        <w:t>Problems</w:t>
+      </w:r>
+    </w:p>
+    <w:p>
+      <w:pPr>
+        <w:pStyle w:val="ListParagraph"/>
+        <w:numPr>
+          <w:ilvl w:val="0"/>
+          <w:numId w:val="2"/>
+        </w:numPr>
+        <w:rPr>
+          <w:lang w:val="en-AU"/>
+        </w:rPr>
+      </w:pPr>
+      <w:r>
+        <w:rPr>
+          <w:lang w:val="en-AU"/>
+        </w:rPr>
+        <w:t xml:space="preserve">Utilised a new </w:t>
+      </w:r>
+      <w:r>
+        <w:rPr>
+          <w:lang w:val="en-AU"/>
+        </w:rPr>
+        <w:t xml:space="preserve">board connection </w:t>
+      </w:r>
+      <w:r>
+        <w:rPr>
+          <w:lang w:val="en-AU"/>
+        </w:rPr>
+        <w:t xml:space="preserve">as the ground connection was dodgy in the last days </w:t>
+      </w:r>
+      <w:r>
+        <w:rPr>
+          <w:lang w:val="en-AU"/>
+        </w:rPr>
+        <w:t xml:space="preserve">project. </w:t>
+      </w:r>
+    </w:p>
+    <w:p>
+      <w:pPr>
+        <w:pStyle w:val="ListParagraph"/>
+        <w:numPr>
+          <w:ilvl w:val="0"/>
+          <w:numId w:val="2"/>
+        </w:numPr>
+        <w:rPr>
+          <w:lang w:val="en-AU"/>
+        </w:rPr>
+      </w:pPr>
+      <w:r>
+        <w:rPr>
+          <w:lang w:val="en-AU"/>
+        </w:rPr>
+        <w:t xml:space="preserve">Slight difficulty finding the tone values for the system. </w:t>
+      </w:r>
+    </w:p>
+    <w:p>
+      <w:pPr>
+        <w:pStyle w:val="ListParagraph"/>
+        <w:numPr>
+          <w:ilvl w:val="0"/>
+          <w:numId w:val="2"/>
+        </w:numPr>
+        <w:rPr>
+          <w:lang w:val="en-AU"/>
+        </w:rPr>
+      </w:pPr>
+      <w:r>
+        <w:rPr>
+          <w:lang w:val="en-AU"/>
+        </w:rPr>
+        <w:t xml:space="preserve">Only uploading once made me recheck my code multiple times to make sure nothing was wrong before I uploaded it. Usually I upload and check for errors after. </w:t>
+      </w:r>
+    </w:p>
+    <w:p>
+      <w:pPr>
+        <w:pStyle w:val="Heading3"/>
+        <w:rPr>
+          <w:lang w:val="en-AU"/>
+        </w:rPr>
+      </w:pPr>
+      <w:r>
+        <w:rPr>
+          <w:lang w:val="en-AU"/>
+        </w:rPr>
+        <w:t>Learning</w:t>
+      </w:r>
+    </w:p>
+    <w:p>
+      <w:pPr>
+        <w:pStyle w:val="ListParagraph"/>
+        <w:numPr>
+          <w:ilvl w:val="0"/>
+          <w:numId w:val="2"/>
+        </w:numPr>
+        <w:rPr>
+          <w:lang w:val="en-AU"/>
+        </w:rPr>
+      </w:pPr>
+      <w:r>
+        <w:rPr>
+          <w:lang w:val="en-AU"/>
+        </w:rPr>
+        <w:t xml:space="preserve">Learnt how tone() works. </w:t>
+      </w:r>
+    </w:p>
+    <w:p>
+      <w:pPr>
+        <w:pStyle w:val="ListParagraph"/>
+        <w:numPr>
+          <w:ilvl w:val="0"/>
+          <w:numId w:val="2"/>
+        </w:numPr>
+        <w:rPr>
+          <w:lang w:val="en-AU"/>
+        </w:rPr>
+      </w:pPr>
+      <w:r>
+        <w:rPr>
+          <w:lang w:val="en-AU"/>
+        </w:rPr>
+        <w:t xml:space="preserve">How to use PWM for sound frequencies. </w:t>
+      </w:r>
+    </w:p>
+    <w:p>
+      <w:pPr>
+        <w:pStyle w:val="Heading1"/>
+        <w:rPr>
+          <w:sz w:val="48"/>
+          <w:szCs w:val="48"/>
+          <w:lang w:val="en-AU"/>
+        </w:rPr>
+      </w:pPr>
+    </w:p>
+    <w:p>
+      <w:pPr>
+        <w:pStyle w:val="Heading1"/>
+        <w:rPr>
+          <w:sz w:val="48"/>
+          <w:szCs w:val="48"/>
+        </w:rPr>
+      </w:pPr>
+      <w:r>
+        <w:rPr>
+          <w:sz w:val="48"/>
+          <w:szCs w:val="48"/>
+          <w:lang w:val="en-AU"/>
+        </w:rPr>
         <w:t xml:space="preserve">Day </w:t>
       </w:r>
       <w:r>

</xml_diff>

<commit_message>
day 011 completed. Hardest day so far
</commit_message>
<xml_diff>
--- a/EmbeddedMiniProject.docx
+++ b/EmbeddedMiniProject.docx
@@ -466,25 +466,43 @@
         <w:rPr>
           <w:lang w:val="en-AU"/>
         </w:rPr>
-        <w:t>Make the Serial tell the pot value and the voltage.</w:t>
-      </w:r>
-    </w:p>
-    <w:p>
-      <w:pPr>
-        <w:pStyle w:val="ListParagraph"/>
-        <w:numPr>
-          <w:ilvl w:val="0"/>
-          <w:numId w:val="2"/>
-        </w:numPr>
-        <w:rPr>
-          <w:lang w:val="en-AU"/>
-        </w:rPr>
-      </w:pPr>
-      <w:r>
-        <w:rPr>
-          <w:lang w:val="en-AU"/>
-        </w:rPr>
-        <w:t xml:space="preserve">Display the same on the serial </w:t>
+        <w:t xml:space="preserve">Combine code from Day 003 into code. </w:t>
+      </w:r>
+    </w:p>
+    <w:p>
+      <w:pPr>
+        <w:pStyle w:val="ListParagraph"/>
+        <w:numPr>
+          <w:ilvl w:val="0"/>
+          <w:numId w:val="2"/>
+        </w:numPr>
+        <w:rPr>
+          <w:lang w:val="en-AU"/>
+        </w:rPr>
+      </w:pPr>
+      <w:r>
+        <w:rPr>
+          <w:lang w:val="en-AU"/>
+        </w:rPr>
+        <w:t xml:space="preserve">Utilise a password protected screen unlocked by the RFID. </w:t>
+      </w:r>
+    </w:p>
+    <w:p>
+      <w:pPr>
+        <w:pStyle w:val="ListParagraph"/>
+        <w:numPr>
+          <w:ilvl w:val="0"/>
+          <w:numId w:val="2"/>
+        </w:numPr>
+        <w:rPr>
+          <w:lang w:val="en-AU"/>
+        </w:rPr>
+      </w:pPr>
+      <w:r>
+        <w:rPr>
+          <w:lang w:val="en-AU"/>
+        </w:rPr>
+        <w:t xml:space="preserve">LCD alerts system when message played. </w:t>
       </w:r>
     </w:p>
     <w:p>
@@ -508,69 +526,45 @@
           <w:ilvl w:val="0"/>
           <w:numId w:val="2"/>
         </w:numPr>
-        <w:rPr>
-          <w:lang w:val="en-AU"/>
-        </w:rPr>
-      </w:pPr>
-      <w:r>
-        <w:rPr>
-          <w:lang w:val="en-AU"/>
-        </w:rPr>
-        <w:t xml:space="preserve">Relearning Wiring for the LCD was a bit confusing, but it worked out. </w:t>
-      </w:r>
-    </w:p>
-    <w:p>
-      <w:pPr>
-        <w:pStyle w:val="ListParagraph"/>
-        <w:numPr>
-          <w:ilvl w:val="0"/>
-          <w:numId w:val="2"/>
-        </w:numPr>
-        <w:rPr>
-          <w:lang w:val="en-AU"/>
-        </w:rPr>
-      </w:pPr>
-      <w:r>
-        <w:rPr>
-          <w:lang w:val="en-AU"/>
-        </w:rPr>
-        <w:t xml:space="preserve">Working out which type of LCD I had was confusing. </w:t>
-      </w:r>
-    </w:p>
-    <w:p>
-      <w:pPr>
-        <w:pStyle w:val="ListParagraph"/>
-        <w:numPr>
-          <w:ilvl w:val="0"/>
-          <w:numId w:val="2"/>
-        </w:numPr>
-        <w:rPr>
-          <w:lang w:val="en-AU"/>
-        </w:rPr>
-      </w:pPr>
-      <w:r>
-        <w:rPr>
-          <w:lang w:val="en-AU"/>
-        </w:rPr>
-        <w:t xml:space="preserve">Had to install correct LCD library. </w:t>
-      </w:r>
-    </w:p>
-    <w:p>
-      <w:pPr>
-        <w:pStyle w:val="ListParagraph"/>
-        <w:numPr>
-          <w:ilvl w:val="0"/>
-          <w:numId w:val="2"/>
-        </w:numPr>
-        <w:rPr>
-          <w:lang w:val="en-AU"/>
-        </w:rPr>
-      </w:pPr>
-      <w:r>
-        <w:rPr>
-          <w:lang w:val="en-AU"/>
-        </w:rPr>
-        <w:t xml:space="preserve">LCD initially not working because it was using the wrong </w:t>
+      </w:pPr>
+      <w:r>
+        <w:t xml:space="preserve">Vibration pin had to move from D10 to D2 due to RC522 SPI conflict </w:t>
+      </w:r>
+    </w:p>
+    <w:p>
+      <w:pPr>
+        <w:pStyle w:val="ListParagraph"/>
+        <w:numPr>
+          <w:ilvl w:val="0"/>
+          <w:numId w:val="2"/>
+        </w:numPr>
+      </w:pPr>
+      <w:r>
+        <w:t xml:space="preserve">LCD wiring swapped (VSS/VDD reversed, SDA/SCL swapped) — fixed manually </w:t>
+      </w:r>
+    </w:p>
+    <w:p>
+      <w:pPr>
+        <w:pStyle w:val="ListParagraph"/>
+        <w:numPr>
+          <w:ilvl w:val="0"/>
+          <w:numId w:val="2"/>
+        </w:numPr>
+        <w:rPr>
+          <w:lang w:val="en-AU"/>
+        </w:rPr>
+      </w:pPr>
+      <w:r>
+        <w:t xml:space="preserve"> Long compile time due to multiple heavy </w:t>
+      </w:r>
+      <w:r>
+        <w:t>libraries</w:t>
+      </w:r>
+      <w:r>
+        <w:rPr>
+          <w:lang w:val="en-AU"/>
+        </w:rPr>
+        <w:t xml:space="preserve"> </w:t>
       </w:r>
     </w:p>
     <w:p>
@@ -592,43 +586,39 @@
         <w:pStyle w:val="ListParagraph"/>
         <w:numPr>
           <w:ilvl w:val="0"/>
-          <w:numId w:val="2"/>
-        </w:numPr>
-        <w:rPr>
-          <w:lang w:val="en-AU"/>
-        </w:rPr>
-      </w:pPr>
-      <w:r>
-        <w:rPr>
-          <w:lang w:val="en-AU"/>
-        </w:rPr>
-        <w:t xml:space="preserve">Install necessary libraries beforehand. </w:t>
-      </w:r>
-    </w:p>
-    <w:p>
-      <w:pPr>
-        <w:pStyle w:val="ListParagraph"/>
-        <w:numPr>
-          <w:ilvl w:val="0"/>
-          <w:numId w:val="2"/>
-        </w:numPr>
-        <w:rPr>
-          <w:lang w:val="en-AU"/>
-        </w:rPr>
-      </w:pPr>
-      <w:r>
-        <w:rPr>
-          <w:lang w:val="en-AU"/>
-        </w:rPr>
-        <w:t xml:space="preserve">LCD is very finnicky. </w:t>
-      </w:r>
-    </w:p>
-    <w:p>
-      <w:pPr>
-        <w:rPr>
-          <w:lang w:val="en-AU"/>
-        </w:rPr>
-      </w:pPr>
+          <w:numId w:val="3"/>
+        </w:numPr>
+      </w:pPr>
+      <w:r>
+        <w:t xml:space="preserve">SPI devices claim specific pins — check conflicts before wiring </w:t>
+      </w:r>
+    </w:p>
+    <w:p>
+      <w:pPr>
+        <w:pStyle w:val="ListParagraph"/>
+        <w:numPr>
+          <w:ilvl w:val="0"/>
+          <w:numId w:val="3"/>
+        </w:numPr>
+      </w:pPr>
+      <w:r>
+        <w:t xml:space="preserve">I2C LCD is finnicky with pin order and VCC/GND labelling </w:t>
+      </w:r>
+    </w:p>
+    <w:p>
+      <w:pPr>
+        <w:pStyle w:val="ListParagraph"/>
+        <w:numPr>
+          <w:ilvl w:val="0"/>
+          <w:numId w:val="3"/>
+        </w:numPr>
+        <w:rPr>
+          <w:lang w:val="en-AU"/>
+        </w:rPr>
+      </w:pPr>
+      <w:r>
+        <w:t>Test each component individually before combining</w:t>
+      </w:r>
     </w:p>
     <w:p>
       <w:pPr>
@@ -6155,23 +6145,7 @@
           <w:szCs w:val="48"/>
           <w:lang w:val="en-AU"/>
         </w:rPr>
-        <w:t xml:space="preserve">– </w:t>
-      </w:r>
-      <w:r>
-        <w:rPr>
-          <w:sz w:val="48"/>
-          <w:szCs w:val="48"/>
-          <w:lang w:val="en-AU"/>
-        </w:rPr>
-        <w:t>25</w:t>
-      </w:r>
-      <w:r>
-        <w:rPr>
-          <w:sz w:val="48"/>
-          <w:szCs w:val="48"/>
-          <w:lang w:val="en-AU"/>
-        </w:rPr>
-        <w:t>/06/2026</w:t>
+        <w:t>– 25/06/2026</w:t>
       </w:r>
     </w:p>
     <w:p>
@@ -6205,15 +6179,27 @@
           <w:bCs/>
           <w:lang w:val="en-AU"/>
         </w:rPr>
-        <w:t xml:space="preserve">Input:  </w:t>
-      </w:r>
+        <w:t>Input:  Photoresistor</w:t>
+      </w:r>
+    </w:p>
+    <w:p>
+      <w:pPr>
+        <w:pStyle w:val="ListParagraph"/>
+        <w:numPr>
+          <w:ilvl w:val="0"/>
+          <w:numId w:val="2"/>
+        </w:numPr>
+        <w:rPr>
+          <w:lang w:val="en-AU"/>
+        </w:rPr>
+      </w:pPr>
       <w:r>
         <w:rPr>
           <w:b/>
           <w:bCs/>
           <w:lang w:val="en-AU"/>
         </w:rPr>
-        <w:t>Photoresistor</w:t>
+        <w:t>Output: Buzzer</w:t>
       </w:r>
     </w:p>
     <w:p>
@@ -6233,35 +6219,7 @@
           <w:bCs/>
           <w:lang w:val="en-AU"/>
         </w:rPr>
-        <w:t>Output: Buzzer</w:t>
-      </w:r>
-    </w:p>
-    <w:p>
-      <w:pPr>
-        <w:pStyle w:val="ListParagraph"/>
-        <w:numPr>
-          <w:ilvl w:val="0"/>
-          <w:numId w:val="2"/>
-        </w:numPr>
-        <w:rPr>
-          <w:lang w:val="en-AU"/>
-        </w:rPr>
-      </w:pPr>
-      <w:r>
-        <w:rPr>
-          <w:b/>
-          <w:bCs/>
-          <w:lang w:val="en-AU"/>
-        </w:rPr>
-        <w:t xml:space="preserve">Chaos: </w:t>
-      </w:r>
-      <w:r>
-        <w:rPr>
-          <w:b/>
-          <w:bCs/>
-          <w:lang w:val="en-AU"/>
-        </w:rPr>
-        <w:t xml:space="preserve">1 upload </w:t>
+        <w:t xml:space="preserve">Chaos: 1 upload </w:t>
       </w:r>
       <w:proofErr w:type="gramStart"/>
       <w:r>
@@ -6541,13 +6499,7 @@
               <w:rPr>
                 <w:lang w:val="en-AU"/>
               </w:rPr>
-              <w:t xml:space="preserve"> </w:t>
-            </w:r>
-            <w:r>
-              <w:rPr>
-                <w:lang w:val="en-AU"/>
-              </w:rPr>
-              <w:t>A side is power, B side is GND and analog input signal.</w:t>
+              <w:t xml:space="preserve"> A side is power, B side is GND and analog input signal.</w:t>
             </w:r>
           </w:p>
         </w:tc>
@@ -6667,6 +6619,785 @@
         <w:rPr>
           <w:lang w:val="en-AU"/>
         </w:rPr>
+        <w:t xml:space="preserve">After uploading, there is a background noise that is quite shrill, further uploads would let me edit it further and improve on it. </w:t>
+      </w:r>
+    </w:p>
+    <w:p>
+      <w:pPr>
+        <w:pStyle w:val="Heading3"/>
+        <w:rPr>
+          <w:lang w:val="en-AU"/>
+        </w:rPr>
+      </w:pPr>
+      <w:r>
+        <w:rPr>
+          <w:lang w:val="en-AU"/>
+        </w:rPr>
+        <w:t>Learning</w:t>
+      </w:r>
+    </w:p>
+    <w:p>
+      <w:pPr>
+        <w:pStyle w:val="ListParagraph"/>
+        <w:numPr>
+          <w:ilvl w:val="0"/>
+          <w:numId w:val="2"/>
+        </w:numPr>
+        <w:rPr>
+          <w:lang w:val="en-AU"/>
+        </w:rPr>
+      </w:pPr>
+      <w:r>
+        <w:rPr>
+          <w:lang w:val="en-AU"/>
+        </w:rPr>
+        <w:t xml:space="preserve">Learnt how to do tones on buzzer. </w:t>
+      </w:r>
+    </w:p>
+    <w:p>
+      <w:pPr>
+        <w:rPr>
+          <w:lang w:val="en-AU"/>
+        </w:rPr>
+      </w:pPr>
+    </w:p>
+    <w:p>
+      <w:pPr>
+        <w:rPr>
+          <w:lang w:val="en-AU"/>
+        </w:rPr>
+      </w:pPr>
+    </w:p>
+    <w:p>
+      <w:pPr>
+        <w:pStyle w:val="Heading1"/>
+        <w:rPr>
+          <w:sz w:val="48"/>
+          <w:szCs w:val="48"/>
+        </w:rPr>
+      </w:pPr>
+      <w:r>
+        <w:rPr>
+          <w:sz w:val="48"/>
+          <w:szCs w:val="48"/>
+          <w:lang w:val="en-AU"/>
+        </w:rPr>
+        <w:lastRenderedPageBreak/>
+        <w:t xml:space="preserve">Day </w:t>
+      </w:r>
+      <w:r>
+        <w:rPr>
+          <w:sz w:val="48"/>
+          <w:szCs w:val="48"/>
+          <w:lang w:val="en-AU"/>
+        </w:rPr>
+        <w:t>1</w:t>
+      </w:r>
+      <w:r>
+        <w:rPr>
+          <w:sz w:val="48"/>
+          <w:szCs w:val="48"/>
+          <w:lang w:val="en-AU"/>
+        </w:rPr>
+        <w:t>1</w:t>
+      </w:r>
+      <w:r>
+        <w:rPr>
+          <w:sz w:val="48"/>
+          <w:szCs w:val="48"/>
+          <w:lang w:val="en-AU"/>
+        </w:rPr>
+        <w:t xml:space="preserve"> </w:t>
+      </w:r>
+      <w:r>
+        <w:rPr>
+          <w:sz w:val="48"/>
+          <w:szCs w:val="48"/>
+          <w:lang w:val="en-AU"/>
+        </w:rPr>
+        <w:t>– 2</w:t>
+      </w:r>
+      <w:r>
+        <w:rPr>
+          <w:sz w:val="48"/>
+          <w:szCs w:val="48"/>
+          <w:lang w:val="en-AU"/>
+        </w:rPr>
+        <w:t>6</w:t>
+      </w:r>
+      <w:r>
+        <w:rPr>
+          <w:sz w:val="48"/>
+          <w:szCs w:val="48"/>
+          <w:lang w:val="en-AU"/>
+        </w:rPr>
+        <w:t>/06/2026</w:t>
+      </w:r>
+    </w:p>
+    <w:p>
+      <w:pPr>
+        <w:pStyle w:val="Heading3"/>
+        <w:rPr>
+          <w:lang w:val="en-AU"/>
+        </w:rPr>
+      </w:pPr>
+      <w:r>
+        <w:rPr>
+          <w:lang w:val="en-AU"/>
+        </w:rPr>
+        <w:t>Wheel Spins</w:t>
+      </w:r>
+    </w:p>
+    <w:p>
+      <w:pPr>
+        <w:pStyle w:val="ListParagraph"/>
+        <w:numPr>
+          <w:ilvl w:val="0"/>
+          <w:numId w:val="2"/>
+        </w:numPr>
+        <w:rPr>
+          <w:lang w:val="en-AU"/>
+        </w:rPr>
+      </w:pPr>
+      <w:r>
+        <w:rPr>
+          <w:b/>
+          <w:bCs/>
+          <w:lang w:val="en-AU"/>
+        </w:rPr>
+        <w:t>Input:</w:t>
+      </w:r>
+      <w:r>
+        <w:rPr>
+          <w:b/>
+          <w:bCs/>
+          <w:lang w:val="en-AU"/>
+        </w:rPr>
+        <w:t xml:space="preserve"> RFID Reader / Vibration. </w:t>
+      </w:r>
+    </w:p>
+    <w:p>
+      <w:pPr>
+        <w:pStyle w:val="ListParagraph"/>
+        <w:numPr>
+          <w:ilvl w:val="0"/>
+          <w:numId w:val="2"/>
+        </w:numPr>
+        <w:rPr>
+          <w:lang w:val="en-AU"/>
+        </w:rPr>
+      </w:pPr>
+      <w:r>
+        <w:rPr>
+          <w:b/>
+          <w:bCs/>
+          <w:lang w:val="en-AU"/>
+        </w:rPr>
+        <w:t xml:space="preserve">Output: </w:t>
+      </w:r>
+      <w:r>
+        <w:rPr>
+          <w:b/>
+          <w:bCs/>
+          <w:lang w:val="en-AU"/>
+        </w:rPr>
+        <w:t>LCD / RGB LED Wheel</w:t>
+      </w:r>
+    </w:p>
+    <w:p>
+      <w:pPr>
+        <w:pStyle w:val="ListParagraph"/>
+        <w:numPr>
+          <w:ilvl w:val="0"/>
+          <w:numId w:val="2"/>
+        </w:numPr>
+        <w:rPr>
+          <w:lang w:val="en-AU"/>
+        </w:rPr>
+      </w:pPr>
+      <w:r>
+        <w:rPr>
+          <w:b/>
+          <w:bCs/>
+          <w:lang w:val="en-AU"/>
+        </w:rPr>
+        <w:t xml:space="preserve">Chaos: </w:t>
+      </w:r>
+      <w:r>
+        <w:rPr>
+          <w:b/>
+          <w:bCs/>
+          <w:lang w:val="en-AU"/>
+        </w:rPr>
+        <w:t xml:space="preserve">Combine with previous project. </w:t>
+      </w:r>
+    </w:p>
+    <w:p>
+      <w:pPr>
+        <w:pStyle w:val="ListParagraph"/>
+        <w:numPr>
+          <w:ilvl w:val="0"/>
+          <w:numId w:val="2"/>
+        </w:numPr>
+        <w:rPr>
+          <w:lang w:val="en-AU"/>
+        </w:rPr>
+      </w:pPr>
+      <w:r>
+        <w:rPr>
+          <w:b/>
+          <w:bCs/>
+          <w:lang w:val="en-AU"/>
+        </w:rPr>
+        <w:t>Evil (if applicable):  N/A</w:t>
+      </w:r>
+    </w:p>
+    <w:p>
+      <w:pPr>
+        <w:pStyle w:val="Heading3"/>
+        <w:rPr>
+          <w:lang w:val="en-AU"/>
+        </w:rPr>
+      </w:pPr>
+      <w:r>
+        <w:rPr>
+          <w:lang w:val="en-AU"/>
+        </w:rPr>
+        <w:t>Objective</w:t>
+      </w:r>
+    </w:p>
+    <w:p>
+      <w:pPr>
+        <w:pStyle w:val="ListParagraph"/>
+        <w:numPr>
+          <w:ilvl w:val="0"/>
+          <w:numId w:val="2"/>
+        </w:numPr>
+        <w:rPr>
+          <w:lang w:val="en-AU"/>
+        </w:rPr>
+      </w:pPr>
+      <w:r>
+        <w:rPr>
+          <w:lang w:val="en-AU"/>
+        </w:rPr>
+        <w:t xml:space="preserve">RFID unlocks system. LCD indicates this. </w:t>
+      </w:r>
+    </w:p>
+    <w:p>
+      <w:pPr>
+        <w:pStyle w:val="ListParagraph"/>
+        <w:numPr>
+          <w:ilvl w:val="0"/>
+          <w:numId w:val="2"/>
+        </w:numPr>
+        <w:rPr>
+          <w:lang w:val="en-AU"/>
+        </w:rPr>
+      </w:pPr>
+      <w:r>
+        <w:rPr>
+          <w:lang w:val="en-AU"/>
+        </w:rPr>
+        <w:t>When vibration is detected, LCD indicates detection, spinning the RGB LED wheel.</w:t>
+      </w:r>
+    </w:p>
+    <w:p>
+      <w:pPr>
+        <w:pStyle w:val="Heading3"/>
+        <w:rPr>
+          <w:lang w:val="en-AU"/>
+        </w:rPr>
+      </w:pPr>
+      <w:r>
+        <w:rPr>
+          <w:lang w:val="en-AU"/>
+        </w:rPr>
+        <w:t>Circuit Diagram and Pin table</w:t>
+      </w:r>
+    </w:p>
+    <w:p>
+      <w:pPr>
+        <w:rPr>
+          <w:lang w:val="en-AU"/>
+        </w:rPr>
+      </w:pPr>
+      <w:r>
+        <w:rPr>
+          <w:lang w:val="en-AU"/>
+        </w:rPr>
+        <w:t xml:space="preserve">Potentiometer </w:t>
+      </w:r>
+    </w:p>
+    <w:tbl>
+      <w:tblPr>
+        <w:tblStyle w:val="TableGrid"/>
+        <w:tblW w:w="0" w:type="auto"/>
+        <w:tblLook w:val="04A0" w:firstRow="1" w:lastRow="0" w:firstColumn="1" w:lastColumn="0" w:noHBand="0" w:noVBand="1"/>
+      </w:tblPr>
+      <w:tblGrid>
+        <w:gridCol w:w="3005"/>
+        <w:gridCol w:w="3005"/>
+        <w:gridCol w:w="3006"/>
+      </w:tblGrid>
+      <w:tr>
+        <w:tc>
+          <w:tcPr>
+            <w:tcW w:w="3005" w:type="dxa"/>
+          </w:tcPr>
+          <w:p>
+            <w:pPr>
+              <w:rPr>
+                <w:lang w:val="en-AU"/>
+              </w:rPr>
+            </w:pPr>
+            <w:r>
+              <w:rPr>
+                <w:lang w:val="en-AU"/>
+              </w:rPr>
+              <w:t>Part</w:t>
+            </w:r>
+          </w:p>
+        </w:tc>
+        <w:tc>
+          <w:tcPr>
+            <w:tcW w:w="3005" w:type="dxa"/>
+          </w:tcPr>
+          <w:p>
+            <w:pPr>
+              <w:rPr>
+                <w:lang w:val="en-AU"/>
+              </w:rPr>
+            </w:pPr>
+            <w:r>
+              <w:rPr>
+                <w:lang w:val="en-AU"/>
+              </w:rPr>
+              <w:t>Pin Num(s)</w:t>
+            </w:r>
+          </w:p>
+        </w:tc>
+        <w:tc>
+          <w:tcPr>
+            <w:tcW w:w="3006" w:type="dxa"/>
+          </w:tcPr>
+          <w:p>
+            <w:pPr>
+              <w:rPr>
+                <w:lang w:val="en-AU"/>
+              </w:rPr>
+            </w:pPr>
+            <w:r>
+              <w:rPr>
+                <w:lang w:val="en-AU"/>
+              </w:rPr>
+              <w:t>Type</w:t>
+            </w:r>
+          </w:p>
+        </w:tc>
+      </w:tr>
+      <w:tr>
+        <w:tc>
+          <w:tcPr>
+            <w:tcW w:w="3005" w:type="dxa"/>
+          </w:tcPr>
+          <w:p>
+            <w:pPr>
+              <w:rPr>
+                <w:lang w:val="en-AU"/>
+              </w:rPr>
+            </w:pPr>
+            <w:r>
+              <w:rPr>
+                <w:lang w:val="en-AU"/>
+              </w:rPr>
+              <w:t>Vibration sensor</w:t>
+            </w:r>
+          </w:p>
+        </w:tc>
+        <w:tc>
+          <w:tcPr>
+            <w:tcW w:w="3005" w:type="dxa"/>
+          </w:tcPr>
+          <w:p>
+            <w:pPr>
+              <w:rPr>
+                <w:lang w:val="en-AU"/>
+              </w:rPr>
+            </w:pPr>
+            <w:r>
+              <w:rPr>
+                <w:lang w:val="en-AU"/>
+              </w:rPr>
+              <w:t>Left to D</w:t>
+            </w:r>
+            <w:r>
+              <w:rPr>
+                <w:lang w:val="en-AU"/>
+              </w:rPr>
+              <w:t>3</w:t>
+            </w:r>
+            <w:r>
+              <w:rPr>
+                <w:lang w:val="en-AU"/>
+              </w:rPr>
+              <w:t>, Right to GND</w:t>
+            </w:r>
+          </w:p>
+        </w:tc>
+        <w:tc>
+          <w:tcPr>
+            <w:tcW w:w="3006" w:type="dxa"/>
+          </w:tcPr>
+          <w:p>
+            <w:pPr>
+              <w:rPr>
+                <w:lang w:val="en-AU"/>
+              </w:rPr>
+            </w:pPr>
+            <w:r>
+              <w:rPr>
+                <w:lang w:val="en-AU"/>
+              </w:rPr>
+              <w:t>Left is a vibration signal, right is ground.</w:t>
+            </w:r>
+          </w:p>
+        </w:tc>
+      </w:tr>
+      <w:tr>
+        <w:tc>
+          <w:tcPr>
+            <w:tcW w:w="3005" w:type="dxa"/>
+          </w:tcPr>
+          <w:p>
+            <w:pPr>
+              <w:rPr>
+                <w:lang w:val="en-AU"/>
+              </w:rPr>
+            </w:pPr>
+            <w:r>
+              <w:rPr>
+                <w:lang w:val="en-AU"/>
+              </w:rPr>
+              <w:t>RGB LED wheel</w:t>
+            </w:r>
+          </w:p>
+        </w:tc>
+        <w:tc>
+          <w:tcPr>
+            <w:tcW w:w="3005" w:type="dxa"/>
+          </w:tcPr>
+          <w:p>
+            <w:pPr>
+              <w:rPr>
+                <w:lang w:val="en-AU"/>
+              </w:rPr>
+            </w:pPr>
+            <w:r>
+              <w:rPr>
+                <w:lang w:val="en-AU"/>
+              </w:rPr>
+              <w:t>S to D6, V to 5V, G to GND</w:t>
+            </w:r>
+          </w:p>
+        </w:tc>
+        <w:tc>
+          <w:tcPr>
+            <w:tcW w:w="3006" w:type="dxa"/>
+          </w:tcPr>
+          <w:p>
+            <w:pPr>
+              <w:rPr>
+                <w:lang w:val="en-AU"/>
+              </w:rPr>
+            </w:pPr>
+            <w:r>
+              <w:rPr>
+                <w:lang w:val="en-AU"/>
+              </w:rPr>
+              <w:t xml:space="preserve">S is a signal, V is voltage, G is Ground. </w:t>
+            </w:r>
+          </w:p>
+        </w:tc>
+      </w:tr>
+      <w:tr>
+        <w:tc>
+          <w:tcPr>
+            <w:tcW w:w="3005" w:type="dxa"/>
+          </w:tcPr>
+          <w:p>
+            <w:pPr>
+              <w:rPr>
+                <w:lang w:val="en-AU"/>
+              </w:rPr>
+            </w:pPr>
+            <w:r>
+              <w:rPr>
+                <w:lang w:val="en-AU"/>
+              </w:rPr>
+              <w:t>LCD</w:t>
+            </w:r>
+          </w:p>
+        </w:tc>
+        <w:tc>
+          <w:tcPr>
+            <w:tcW w:w="3005" w:type="dxa"/>
+          </w:tcPr>
+          <w:p>
+            <w:pPr>
+              <w:rPr>
+                <w:lang w:val="en-AU"/>
+              </w:rPr>
+            </w:pPr>
+            <w:r>
+              <w:rPr>
+                <w:lang w:val="en-AU"/>
+              </w:rPr>
+              <w:t xml:space="preserve">VSS to </w:t>
+            </w:r>
+            <w:proofErr w:type="gramStart"/>
+            <w:r>
+              <w:rPr>
+                <w:lang w:val="en-AU"/>
+              </w:rPr>
+              <w:t>ground,  VDD</w:t>
+            </w:r>
+            <w:proofErr w:type="gramEnd"/>
+            <w:r>
+              <w:rPr>
+                <w:lang w:val="en-AU"/>
+              </w:rPr>
+              <w:t xml:space="preserve"> to 5V, SCK to A4 and SDA to A5. </w:t>
+            </w:r>
+          </w:p>
+        </w:tc>
+        <w:tc>
+          <w:tcPr>
+            <w:tcW w:w="3006" w:type="dxa"/>
+          </w:tcPr>
+          <w:p>
+            <w:pPr>
+              <w:rPr>
+                <w:lang w:val="en-AU"/>
+              </w:rPr>
+            </w:pPr>
+            <w:r>
+              <w:rPr>
+                <w:lang w:val="en-AU"/>
+              </w:rPr>
+              <w:t>VSS is ground, VDD is 5V (power), SCK and SDA are clock and data respectively</w:t>
+            </w:r>
+          </w:p>
+        </w:tc>
+      </w:tr>
+      <w:tr>
+        <w:tc>
+          <w:tcPr>
+            <w:tcW w:w="3005" w:type="dxa"/>
+          </w:tcPr>
+          <w:p>
+            <w:pPr>
+              <w:rPr>
+                <w:lang w:val="en-AU"/>
+              </w:rPr>
+            </w:pPr>
+            <w:r>
+              <w:rPr>
+                <w:lang w:val="en-AU"/>
+              </w:rPr>
+              <w:t>RFID Reader</w:t>
+            </w:r>
+          </w:p>
+        </w:tc>
+        <w:tc>
+          <w:tcPr>
+            <w:tcW w:w="3005" w:type="dxa"/>
+          </w:tcPr>
+          <w:p>
+            <w:pPr>
+              <w:rPr>
+                <w:lang w:val="en-AU"/>
+              </w:rPr>
+            </w:pPr>
+            <w:r>
+              <w:rPr>
+                <w:lang w:val="en-AU"/>
+              </w:rPr>
+              <w:t>SDA to D10, SCK to D13, MOSI to D11, MISO to D12, IRQ not connected, GND to GND, RST to D</w:t>
+            </w:r>
+            <w:proofErr w:type="gramStart"/>
+            <w:r>
+              <w:rPr>
+                <w:lang w:val="en-AU"/>
+              </w:rPr>
+              <w:t>9 ,</w:t>
+            </w:r>
+            <w:proofErr w:type="gramEnd"/>
+            <w:r>
+              <w:rPr>
+                <w:lang w:val="en-AU"/>
+              </w:rPr>
+              <w:t xml:space="preserve"> 3.3V to 3.3V</w:t>
+            </w:r>
+          </w:p>
+        </w:tc>
+        <w:tc>
+          <w:tcPr>
+            <w:tcW w:w="3006" w:type="dxa"/>
+          </w:tcPr>
+          <w:p>
+            <w:pPr>
+              <w:rPr>
+                <w:lang w:val="en-AU"/>
+              </w:rPr>
+            </w:pPr>
+            <w:r>
+              <w:rPr>
+                <w:lang w:val="en-AU"/>
+              </w:rPr>
+              <w:t xml:space="preserve">SDA is chip select, SPI clock keeps both devices together, MOSI is data from Arduino, MISO </w:t>
+            </w:r>
+            <w:proofErr w:type="spellStart"/>
+            <w:r>
+              <w:rPr>
+                <w:lang w:val="en-AU"/>
+              </w:rPr>
+              <w:t>si</w:t>
+            </w:r>
+            <w:proofErr w:type="spellEnd"/>
+            <w:r>
+              <w:rPr>
+                <w:lang w:val="en-AU"/>
+              </w:rPr>
+              <w:t xml:space="preserve"> data to Arduino, IRQ is interrupt Pin (which </w:t>
+            </w:r>
+            <w:proofErr w:type="spellStart"/>
+            <w:r>
+              <w:rPr>
+                <w:lang w:val="en-AU"/>
+              </w:rPr>
+              <w:t>im</w:t>
+            </w:r>
+            <w:proofErr w:type="spellEnd"/>
+            <w:r>
+              <w:rPr>
+                <w:lang w:val="en-AU"/>
+              </w:rPr>
+              <w:t xml:space="preserve"> not using), GND is ground, RST is the reset pin, 3.3V is power. </w:t>
+            </w:r>
+          </w:p>
+        </w:tc>
+      </w:tr>
+    </w:tbl>
+    <w:p>
+      <w:pPr>
+        <w:rPr>
+          <w:lang w:val="en-AU"/>
+        </w:rPr>
+      </w:pPr>
+    </w:p>
+    <w:p>
+      <w:pPr>
+        <w:pStyle w:val="Heading3"/>
+        <w:rPr>
+          <w:lang w:val="en-AU"/>
+        </w:rPr>
+      </w:pPr>
+      <w:r>
+        <w:rPr>
+          <w:lang w:val="en-AU"/>
+        </w:rPr>
+        <w:t>Code notes</w:t>
+      </w:r>
+    </w:p>
+    <w:p>
+      <w:pPr>
+        <w:pStyle w:val="ListParagraph"/>
+        <w:numPr>
+          <w:ilvl w:val="0"/>
+          <w:numId w:val="2"/>
+        </w:numPr>
+        <w:rPr>
+          <w:lang w:val="en-AU"/>
+        </w:rPr>
+      </w:pPr>
+    </w:p>
+    <w:p>
+      <w:pPr>
+        <w:pStyle w:val="Heading3"/>
+        <w:rPr>
+          <w:lang w:val="en-AU"/>
+        </w:rPr>
+      </w:pPr>
+      <w:r>
+        <w:rPr>
+          <w:lang w:val="en-AU"/>
+        </w:rPr>
+        <w:t>Problems</w:t>
+      </w:r>
+    </w:p>
+    <w:p>
+      <w:pPr>
+        <w:pStyle w:val="ListParagraph"/>
+        <w:numPr>
+          <w:ilvl w:val="0"/>
+          <w:numId w:val="2"/>
+        </w:numPr>
+        <w:rPr>
+          <w:lang w:val="en-AU"/>
+        </w:rPr>
+      </w:pPr>
+      <w:r>
+        <w:rPr>
+          <w:lang w:val="en-AU"/>
+        </w:rPr>
+        <w:t xml:space="preserve">No troubleshooting meant I had to account more many variables on the first attempt, I lowered frequency from 2000 </w:t>
+      </w:r>
+      <w:proofErr w:type="spellStart"/>
+      <w:r>
+        <w:rPr>
+          <w:lang w:val="en-AU"/>
+        </w:rPr>
+        <w:t>hz</w:t>
+      </w:r>
+      <w:proofErr w:type="spellEnd"/>
+      <w:r>
+        <w:rPr>
+          <w:lang w:val="en-AU"/>
+        </w:rPr>
+        <w:t xml:space="preserve"> max to 1000 </w:t>
+      </w:r>
+      <w:proofErr w:type="spellStart"/>
+      <w:r>
+        <w:rPr>
+          <w:lang w:val="en-AU"/>
+        </w:rPr>
+        <w:t>hz</w:t>
+      </w:r>
+      <w:proofErr w:type="spellEnd"/>
+      <w:r>
+        <w:rPr>
+          <w:lang w:val="en-AU"/>
+        </w:rPr>
+        <w:t xml:space="preserve"> max to make sure the system wasn’t overwhelmingly harmful to listen to. </w:t>
+      </w:r>
+    </w:p>
+    <w:p>
+      <w:pPr>
+        <w:pStyle w:val="ListParagraph"/>
+        <w:numPr>
+          <w:ilvl w:val="0"/>
+          <w:numId w:val="2"/>
+        </w:numPr>
+        <w:rPr>
+          <w:lang w:val="en-AU"/>
+        </w:rPr>
+      </w:pPr>
+      <w:r>
+        <w:rPr>
+          <w:lang w:val="en-AU"/>
+        </w:rPr>
+        <w:lastRenderedPageBreak/>
         <w:t xml:space="preserve">After uploading, there is a background noise that is quite shrill, further uploads would let me edit it further and improve on it. </w:t>
       </w:r>
     </w:p>
@@ -7244,9 +7975,9 @@
     </w:lvl>
   </w:abstractNum>
   <w:abstractNum w:abstractNumId="1" w15:restartNumberingAfterBreak="0">
-    <w:nsid w:val="709F493D"/>
+    <w:nsid w:val="5D42006F"/>
     <w:multiLevelType w:val="hybridMultilevel"/>
-    <w:tmpl w:val="56B2443C"/>
+    <w:tmpl w:val="B2CE3A06"/>
     <w:lvl w:ilvl="0" w:tplc="0C6A7D88">
       <w:numFmt w:val="bullet"/>
       <w:lvlText w:val="-"/>
@@ -7355,10 +8086,125 @@
       </w:rPr>
     </w:lvl>
   </w:abstractNum>
+  <w:abstractNum w:abstractNumId="2" w15:restartNumberingAfterBreak="0">
+    <w:nsid w:val="709F493D"/>
+    <w:multiLevelType w:val="hybridMultilevel"/>
+    <w:tmpl w:val="56B2443C"/>
+    <w:lvl w:ilvl="0" w:tplc="0C6A7D88">
+      <w:numFmt w:val="bullet"/>
+      <w:lvlText w:val="-"/>
+      <w:lvlJc w:val="left"/>
+      <w:pPr>
+        <w:ind w:left="720" w:hanging="360"/>
+      </w:pPr>
+      <w:rPr>
+        <w:rFonts w:ascii="Aptos" w:eastAsiaTheme="minorHAnsi" w:hAnsi="Aptos" w:cstheme="minorBidi" w:hint="default"/>
+      </w:rPr>
+    </w:lvl>
+    <w:lvl w:ilvl="1" w:tplc="08090003" w:tentative="1">
+      <w:start w:val="1"/>
+      <w:numFmt w:val="bullet"/>
+      <w:lvlText w:val="o"/>
+      <w:lvlJc w:val="left"/>
+      <w:pPr>
+        <w:ind w:left="1440" w:hanging="360"/>
+      </w:pPr>
+      <w:rPr>
+        <w:rFonts w:ascii="Courier New" w:hAnsi="Courier New" w:cs="Courier New" w:hint="default"/>
+      </w:rPr>
+    </w:lvl>
+    <w:lvl w:ilvl="2" w:tplc="08090005" w:tentative="1">
+      <w:start w:val="1"/>
+      <w:numFmt w:val="bullet"/>
+      <w:lvlText w:val=""/>
+      <w:lvlJc w:val="left"/>
+      <w:pPr>
+        <w:ind w:left="2160" w:hanging="360"/>
+      </w:pPr>
+      <w:rPr>
+        <w:rFonts w:ascii="Wingdings" w:hAnsi="Wingdings" w:hint="default"/>
+      </w:rPr>
+    </w:lvl>
+    <w:lvl w:ilvl="3" w:tplc="08090001" w:tentative="1">
+      <w:start w:val="1"/>
+      <w:numFmt w:val="bullet"/>
+      <w:lvlText w:val=""/>
+      <w:lvlJc w:val="left"/>
+      <w:pPr>
+        <w:ind w:left="2880" w:hanging="360"/>
+      </w:pPr>
+      <w:rPr>
+        <w:rFonts w:ascii="Symbol" w:hAnsi="Symbol" w:hint="default"/>
+      </w:rPr>
+    </w:lvl>
+    <w:lvl w:ilvl="4" w:tplc="08090003" w:tentative="1">
+      <w:start w:val="1"/>
+      <w:numFmt w:val="bullet"/>
+      <w:lvlText w:val="o"/>
+      <w:lvlJc w:val="left"/>
+      <w:pPr>
+        <w:ind w:left="3600" w:hanging="360"/>
+      </w:pPr>
+      <w:rPr>
+        <w:rFonts w:ascii="Courier New" w:hAnsi="Courier New" w:cs="Courier New" w:hint="default"/>
+      </w:rPr>
+    </w:lvl>
+    <w:lvl w:ilvl="5" w:tplc="08090005" w:tentative="1">
+      <w:start w:val="1"/>
+      <w:numFmt w:val="bullet"/>
+      <w:lvlText w:val=""/>
+      <w:lvlJc w:val="left"/>
+      <w:pPr>
+        <w:ind w:left="4320" w:hanging="360"/>
+      </w:pPr>
+      <w:rPr>
+        <w:rFonts w:ascii="Wingdings" w:hAnsi="Wingdings" w:hint="default"/>
+      </w:rPr>
+    </w:lvl>
+    <w:lvl w:ilvl="6" w:tplc="08090001" w:tentative="1">
+      <w:start w:val="1"/>
+      <w:numFmt w:val="bullet"/>
+      <w:lvlText w:val=""/>
+      <w:lvlJc w:val="left"/>
+      <w:pPr>
+        <w:ind w:left="5040" w:hanging="360"/>
+      </w:pPr>
+      <w:rPr>
+        <w:rFonts w:ascii="Symbol" w:hAnsi="Symbol" w:hint="default"/>
+      </w:rPr>
+    </w:lvl>
+    <w:lvl w:ilvl="7" w:tplc="08090003" w:tentative="1">
+      <w:start w:val="1"/>
+      <w:numFmt w:val="bullet"/>
+      <w:lvlText w:val="o"/>
+      <w:lvlJc w:val="left"/>
+      <w:pPr>
+        <w:ind w:left="5760" w:hanging="360"/>
+      </w:pPr>
+      <w:rPr>
+        <w:rFonts w:ascii="Courier New" w:hAnsi="Courier New" w:cs="Courier New" w:hint="default"/>
+      </w:rPr>
+    </w:lvl>
+    <w:lvl w:ilvl="8" w:tplc="08090005" w:tentative="1">
+      <w:start w:val="1"/>
+      <w:numFmt w:val="bullet"/>
+      <w:lvlText w:val=""/>
+      <w:lvlJc w:val="left"/>
+      <w:pPr>
+        <w:ind w:left="6480" w:hanging="360"/>
+      </w:pPr>
+      <w:rPr>
+        <w:rFonts w:ascii="Wingdings" w:hAnsi="Wingdings" w:hint="default"/>
+      </w:rPr>
+    </w:lvl>
+  </w:abstractNum>
   <w:num w:numId="1" w16cid:durableId="371225130">
     <w:abstractNumId w:val="0"/>
   </w:num>
   <w:num w:numId="2" w16cid:durableId="146938524">
+    <w:abstractNumId w:val="2"/>
+  </w:num>
+  <w:num w:numId="3" w16cid:durableId="1476483029">
     <w:abstractNumId w:val="1"/>
   </w:num>
 </w:numbering>
@@ -7964,7 +8810,6 @@
   <w:style w:type="character" w:default="1" w:styleId="DefaultParagraphFont">
     <w:name w:val="Default Paragraph Font"/>
     <w:uiPriority w:val="1"/>
-    <w:semiHidden/>
     <w:unhideWhenUsed/>
   </w:style>
   <w:style w:type="table" w:default="1" w:styleId="TableNormal">

</xml_diff>

<commit_message>
day 16, will be on break for a week and a bit cause im on holiday
</commit_message>
<xml_diff>
--- a/EmbeddedMiniProject.docx
+++ b/EmbeddedMiniProject.docx
@@ -318,21 +318,7 @@
               <w:rPr>
                 <w:lang w:val="en-AU"/>
               </w:rPr>
-              <w:t xml:space="preserve">VSS to </w:t>
-            </w:r>
-            <w:proofErr w:type="gramStart"/>
-            <w:r>
-              <w:rPr>
-                <w:lang w:val="en-AU"/>
-              </w:rPr>
-              <w:t>ground,  VDD</w:t>
-            </w:r>
-            <w:proofErr w:type="gramEnd"/>
-            <w:r>
-              <w:rPr>
-                <w:lang w:val="en-AU"/>
-              </w:rPr>
-              <w:t xml:space="preserve"> to 5V, SCK to A4 and SDA to A5. </w:t>
+              <w:t xml:space="preserve">VSS to ground,  VDD to 5V, SCK to A4 and SDA to A5. </w:t>
             </w:r>
           </w:p>
         </w:tc>
@@ -1010,21 +996,7 @@
               <w:rPr>
                 <w:lang w:val="en-AU"/>
               </w:rPr>
-              <w:t xml:space="preserve">2, then 3,4,5,6,7,8 and rightmost pin </w:t>
-            </w:r>
-            <w:proofErr w:type="gramStart"/>
-            <w:r>
-              <w:rPr>
-                <w:lang w:val="en-AU"/>
-              </w:rPr>
-              <w:t>at  \</w:t>
-            </w:r>
-            <w:proofErr w:type="gramEnd"/>
-            <w:r>
-              <w:rPr>
-                <w:lang w:val="en-AU"/>
-              </w:rPr>
-              <w:t>9</w:t>
+              <w:t>2, then 3,4,5,6,7,8 and rightmost pin at  \9</w:t>
             </w:r>
             <w:r>
               <w:rPr>
@@ -1901,21 +1873,7 @@
         <w:rPr>
           <w:lang w:val="en-AU"/>
         </w:rPr>
-        <w:t xml:space="preserve">J </w:t>
-      </w:r>
-      <w:proofErr w:type="gramStart"/>
-      <w:r>
-        <w:rPr>
-          <w:lang w:val="en-AU"/>
-        </w:rPr>
-        <w:t>is  dot</w:t>
-      </w:r>
-      <w:proofErr w:type="gramEnd"/>
-      <w:r>
-        <w:rPr>
-          <w:lang w:val="en-AU"/>
-        </w:rPr>
-        <w:t xml:space="preserve"> dash </w:t>
+        <w:t xml:space="preserve">J is  dot dash </w:t>
       </w:r>
       <w:proofErr w:type="spellStart"/>
       <w:r>
@@ -2606,21 +2564,7 @@
         <w:rPr>
           <w:lang w:val="en-AU"/>
         </w:rPr>
-        <w:t xml:space="preserve">Randomization picks 0 through </w:t>
-      </w:r>
-      <w:proofErr w:type="gramStart"/>
-      <w:r>
-        <w:rPr>
-          <w:lang w:val="en-AU"/>
-        </w:rPr>
-        <w:t>255  and</w:t>
-      </w:r>
-      <w:proofErr w:type="gramEnd"/>
-      <w:r>
-        <w:rPr>
-          <w:lang w:val="en-AU"/>
-        </w:rPr>
-        <w:t xml:space="preserve"> uses it in HSV colour to input random colours. </w:t>
+        <w:t xml:space="preserve">Randomization picks 0 through 255  and uses it in HSV colour to input random colours. </w:t>
       </w:r>
     </w:p>
     <w:p>
@@ -3348,21 +3292,7 @@
         <w:rPr>
           <w:lang w:val="en-AU"/>
         </w:rPr>
-        <w:t xml:space="preserve">Use micros (because </w:t>
-      </w:r>
-      <w:proofErr w:type="gramStart"/>
-      <w:r>
-        <w:rPr>
-          <w:lang w:val="en-AU"/>
-        </w:rPr>
-        <w:t>of  the</w:t>
-      </w:r>
-      <w:proofErr w:type="gramEnd"/>
-      <w:r>
-        <w:rPr>
-          <w:lang w:val="en-AU"/>
-        </w:rPr>
-        <w:t xml:space="preserve"> evil challenge. </w:t>
+        <w:t xml:space="preserve">Use micros (because of  the evil challenge. </w:t>
       </w:r>
     </w:p>
     <w:p>
@@ -3617,21 +3547,7 @@
         <w:rPr>
           <w:lang w:val="en-AU"/>
         </w:rPr>
-        <w:t xml:space="preserve">Use a </w:t>
-      </w:r>
-      <w:proofErr w:type="gramStart"/>
-      <w:r>
-        <w:rPr>
-          <w:lang w:val="en-AU"/>
-        </w:rPr>
-        <w:t>servo motor x directions</w:t>
-      </w:r>
-      <w:proofErr w:type="gramEnd"/>
-      <w:r>
-        <w:rPr>
-          <w:lang w:val="en-AU"/>
-        </w:rPr>
-        <w:t xml:space="preserve"> to move a servo motor clockwise and counterclockwise. </w:t>
+        <w:t xml:space="preserve">Use a servo motor x directions to move a servo motor clockwise and counterclockwise. </w:t>
       </w:r>
     </w:p>
     <w:p>
@@ -3775,30 +3691,8 @@
               <w:rPr>
                 <w:lang w:val="en-AU"/>
               </w:rPr>
-              <w:t xml:space="preserve"> to A0. Rest unwired </w:t>
-            </w:r>
-            <w:proofErr w:type="gramStart"/>
-            <w:r>
-              <w:rPr>
-                <w:lang w:val="en-AU"/>
-              </w:rPr>
-              <w:t>( no</w:t>
-            </w:r>
-            <w:proofErr w:type="gramEnd"/>
-            <w:r>
-              <w:rPr>
-                <w:lang w:val="en-AU"/>
-              </w:rPr>
-              <w:t xml:space="preserve"> </w:t>
-            </w:r>
-            <w:proofErr w:type="gramStart"/>
-            <w:r>
-              <w:rPr>
-                <w:lang w:val="en-AU"/>
-              </w:rPr>
-              <w:t>need )</w:t>
-            </w:r>
-            <w:proofErr w:type="gramEnd"/>
+              <w:t xml:space="preserve"> to A0. Rest unwired ( no need )</w:t>
+            </w:r>
           </w:p>
         </w:tc>
         <w:tc>
@@ -4166,25 +4060,7 @@
           <w:bCs/>
           <w:lang w:val="en-AU"/>
         </w:rPr>
-        <w:t xml:space="preserve">Chaos: </w:t>
-      </w:r>
-      <w:proofErr w:type="gramStart"/>
-      <w:r>
-        <w:rPr>
-          <w:b/>
-          <w:bCs/>
-          <w:lang w:val="en-AU"/>
-        </w:rPr>
-        <w:t>Have to</w:t>
-      </w:r>
-      <w:proofErr w:type="gramEnd"/>
-      <w:r>
-        <w:rPr>
-          <w:b/>
-          <w:bCs/>
-          <w:lang w:val="en-AU"/>
-        </w:rPr>
-        <w:t xml:space="preserve"> utilise Relay part. </w:t>
+        <w:t xml:space="preserve">Chaos: Have to utilise Relay part. </w:t>
       </w:r>
     </w:p>
     <w:p>
@@ -4781,25 +4657,7 @@
           <w:szCs w:val="48"/>
           <w:lang w:val="en-AU"/>
         </w:rPr>
-        <w:t xml:space="preserve">8 </w:t>
-      </w:r>
-      <w:proofErr w:type="gramStart"/>
-      <w:r>
-        <w:rPr>
-          <w:sz w:val="48"/>
-          <w:szCs w:val="48"/>
-          <w:lang w:val="en-AU"/>
-        </w:rPr>
-        <w:t>-  23</w:t>
-      </w:r>
-      <w:proofErr w:type="gramEnd"/>
-      <w:r>
-        <w:rPr>
-          <w:sz w:val="48"/>
-          <w:szCs w:val="48"/>
-          <w:lang w:val="en-AU"/>
-        </w:rPr>
-        <w:t>/06/2026</w:t>
+        <w:t>8 -  23/06/2026</w:t>
       </w:r>
     </w:p>
     <w:p>
@@ -4920,21 +4778,7 @@
         <w:rPr>
           <w:lang w:val="en-AU"/>
         </w:rPr>
-        <w:t xml:space="preserve">Make a speaker that plays </w:t>
-      </w:r>
-      <w:proofErr w:type="gramStart"/>
-      <w:r>
-        <w:rPr>
-          <w:lang w:val="en-AU"/>
-        </w:rPr>
-        <w:t>C,E</w:t>
-      </w:r>
-      <w:proofErr w:type="gramEnd"/>
-      <w:r>
-        <w:rPr>
-          <w:lang w:val="en-AU"/>
-        </w:rPr>
-        <w:t xml:space="preserve"> and G tones. </w:t>
+        <w:t xml:space="preserve">Make a speaker that plays C,E and G tones. </w:t>
       </w:r>
     </w:p>
     <w:p>
@@ -5383,21 +5227,7 @@
         <w:rPr>
           <w:lang w:val="en-AU"/>
         </w:rPr>
-        <w:t xml:space="preserve">Only uploading once made me recheck my code multiple times to make sure nothing was wrong before I uploaded it. </w:t>
-      </w:r>
-      <w:proofErr w:type="gramStart"/>
-      <w:r>
-        <w:rPr>
-          <w:lang w:val="en-AU"/>
-        </w:rPr>
-        <w:t>Usually</w:t>
-      </w:r>
-      <w:proofErr w:type="gramEnd"/>
-      <w:r>
-        <w:rPr>
-          <w:lang w:val="en-AU"/>
-        </w:rPr>
-        <w:t xml:space="preserve"> I upload and check for errors after. </w:t>
+        <w:t xml:space="preserve">Only uploading once made me recheck my code multiple times to make sure nothing was wrong before I uploaded it. Usually I upload and check for errors after. </w:t>
       </w:r>
     </w:p>
     <w:p>
@@ -5429,21 +5259,7 @@
         <w:rPr>
           <w:lang w:val="en-AU"/>
         </w:rPr>
-        <w:t xml:space="preserve">Learnt how </w:t>
-      </w:r>
-      <w:proofErr w:type="gramStart"/>
-      <w:r>
-        <w:rPr>
-          <w:lang w:val="en-AU"/>
-        </w:rPr>
-        <w:t>tone(</w:t>
-      </w:r>
-      <w:proofErr w:type="gramEnd"/>
-      <w:r>
-        <w:rPr>
-          <w:lang w:val="en-AU"/>
-        </w:rPr>
-        <w:t xml:space="preserve">) works. </w:t>
+        <w:t xml:space="preserve">Learnt how tone() works. </w:t>
       </w:r>
     </w:p>
     <w:p>
@@ -5501,25 +5317,7 @@
           <w:szCs w:val="48"/>
           <w:lang w:val="en-AU"/>
         </w:rPr>
-        <w:t xml:space="preserve">9 </w:t>
-      </w:r>
-      <w:proofErr w:type="gramStart"/>
-      <w:r>
-        <w:rPr>
-          <w:sz w:val="48"/>
-          <w:szCs w:val="48"/>
-          <w:lang w:val="en-AU"/>
-        </w:rPr>
-        <w:t>-  24</w:t>
-      </w:r>
-      <w:proofErr w:type="gramEnd"/>
-      <w:r>
-        <w:rPr>
-          <w:sz w:val="48"/>
-          <w:szCs w:val="48"/>
-          <w:lang w:val="en-AU"/>
-        </w:rPr>
-        <w:t>/06/2026</w:t>
+        <w:t>9 -  24/06/2026</w:t>
       </w:r>
     </w:p>
     <w:p>
@@ -5593,25 +5391,7 @@
           <w:bCs/>
           <w:lang w:val="en-AU"/>
         </w:rPr>
-        <w:t xml:space="preserve">Chaos: Left </w:t>
-      </w:r>
-      <w:proofErr w:type="gramStart"/>
-      <w:r>
-        <w:rPr>
-          <w:b/>
-          <w:bCs/>
-          <w:lang w:val="en-AU"/>
-        </w:rPr>
-        <w:t>Side Board</w:t>
-      </w:r>
-      <w:proofErr w:type="gramEnd"/>
-      <w:r>
-        <w:rPr>
-          <w:b/>
-          <w:bCs/>
-          <w:lang w:val="en-AU"/>
-        </w:rPr>
-        <w:t xml:space="preserve"> Only. </w:t>
+        <w:t xml:space="preserve">Chaos: Left Side Board Only. </w:t>
       </w:r>
     </w:p>
     <w:p>
@@ -5831,21 +5611,7 @@
               <w:rPr>
                 <w:lang w:val="en-AU"/>
               </w:rPr>
-              <w:t xml:space="preserve">Left most pin to 2, then 3,4,5,6,7,8 and rightmost pin </w:t>
-            </w:r>
-            <w:proofErr w:type="gramStart"/>
-            <w:r>
-              <w:rPr>
-                <w:lang w:val="en-AU"/>
-              </w:rPr>
-              <w:t>at  \</w:t>
-            </w:r>
-            <w:proofErr w:type="gramEnd"/>
-            <w:r>
-              <w:rPr>
-                <w:lang w:val="en-AU"/>
-              </w:rPr>
-              <w:t xml:space="preserve">9 </w:t>
+              <w:t xml:space="preserve">Left most pin to 2, then 3,4,5,6,7,8 and rightmost pin at  \9 </w:t>
             </w:r>
           </w:p>
         </w:tc>
@@ -5926,17 +5692,12 @@
         <w:t xml:space="preserve">Non-blocking melody playback using </w:t>
       </w:r>
       <w:proofErr w:type="spellStart"/>
-      <w:proofErr w:type="gramStart"/>
       <w:r>
         <w:t>millis</w:t>
       </w:r>
       <w:proofErr w:type="spellEnd"/>
       <w:r>
-        <w:t>()</w:t>
-      </w:r>
-      <w:proofErr w:type="gramEnd"/>
-      <w:r>
-        <w:t xml:space="preserve"> so keypad stays responsive during songs. </w:t>
+        <w:t xml:space="preserve">() so keypad stays responsive during songs. </w:t>
       </w:r>
     </w:p>
     <w:p>
@@ -5951,30 +5712,20 @@
         </w:rPr>
       </w:pPr>
       <w:proofErr w:type="spellStart"/>
-      <w:proofErr w:type="gramStart"/>
       <w:r>
         <w:t>startMelody</w:t>
       </w:r>
       <w:proofErr w:type="spellEnd"/>
       <w:r>
-        <w:t>(</w:t>
-      </w:r>
-      <w:proofErr w:type="gramEnd"/>
-      <w:r>
-        <w:t xml:space="preserve">) and </w:t>
+        <w:t xml:space="preserve">() and </w:t>
       </w:r>
       <w:proofErr w:type="spellStart"/>
-      <w:proofErr w:type="gramStart"/>
       <w:r>
         <w:t>updateMelody</w:t>
       </w:r>
       <w:proofErr w:type="spellEnd"/>
       <w:r>
-        <w:t>(</w:t>
-      </w:r>
-      <w:proofErr w:type="gramEnd"/>
-      <w:r>
-        <w:t>) functions handle all melody state.</w:t>
+        <w:t>() functions handle all melody state.</w:t>
       </w:r>
       <w:r>
         <w:rPr>
@@ -6045,17 +5796,12 @@
         <w:t xml:space="preserve">Pause/resume required careful </w:t>
       </w:r>
       <w:proofErr w:type="spellStart"/>
-      <w:proofErr w:type="gramStart"/>
       <w:r>
         <w:t>millis</w:t>
       </w:r>
       <w:proofErr w:type="spellEnd"/>
       <w:r>
-        <w:t>(</w:t>
-      </w:r>
-      <w:proofErr w:type="gramEnd"/>
-      <w:r>
-        <w:t>) bookkeeping to avoid notes getting cut short on resume</w:t>
+        <w:t>() bookkeeping to avoid notes getting cut short on resume</w:t>
       </w:r>
       <w:r>
         <w:rPr>
@@ -6216,18 +5962,8 @@
           <w:bCs/>
           <w:lang w:val="en-AU"/>
         </w:rPr>
-        <w:t xml:space="preserve">Chaos: 1 upload </w:t>
-      </w:r>
-      <w:proofErr w:type="gramStart"/>
-      <w:r>
-        <w:rPr>
-          <w:b/>
-          <w:bCs/>
-          <w:lang w:val="en-AU"/>
-        </w:rPr>
-        <w:t>attempt .</w:t>
-      </w:r>
-      <w:proofErr w:type="gramEnd"/>
+        <w:t>Chaos: 1 upload attempt .</w:t>
+      </w:r>
     </w:p>
     <w:p>
       <w:pPr>
@@ -6464,21 +6200,7 @@
               <w:rPr>
                 <w:lang w:val="en-AU"/>
               </w:rPr>
-              <w:t xml:space="preserve">A </w:t>
-            </w:r>
-            <w:proofErr w:type="gramStart"/>
-            <w:r>
-              <w:rPr>
-                <w:lang w:val="en-AU"/>
-              </w:rPr>
-              <w:t>side  to</w:t>
-            </w:r>
-            <w:proofErr w:type="gramEnd"/>
-            <w:r>
-              <w:rPr>
-                <w:lang w:val="en-AU"/>
-              </w:rPr>
-              <w:t xml:space="preserve"> 5V, B side to A0 and GND through 10k resistor. </w:t>
+              <w:t xml:space="preserve">A side  to 5V, B side to A0 and GND through 10k resistor. </w:t>
             </w:r>
           </w:p>
         </w:tc>
@@ -7102,21 +6824,7 @@
               <w:rPr>
                 <w:lang w:val="en-AU"/>
               </w:rPr>
-              <w:t xml:space="preserve">VSS to </w:t>
-            </w:r>
-            <w:proofErr w:type="gramStart"/>
-            <w:r>
-              <w:rPr>
-                <w:lang w:val="en-AU"/>
-              </w:rPr>
-              <w:t>ground,  VDD</w:t>
-            </w:r>
-            <w:proofErr w:type="gramEnd"/>
-            <w:r>
-              <w:rPr>
-                <w:lang w:val="en-AU"/>
-              </w:rPr>
-              <w:t xml:space="preserve"> to 5V, SCK to A4 and SDA to A5. </w:t>
+              <w:t xml:space="preserve">VSS to ground,  VDD to 5V, SCK to A4 and SDA to A5. </w:t>
             </w:r>
           </w:p>
         </w:tc>
@@ -7172,21 +6880,7 @@
               <w:rPr>
                 <w:lang w:val="en-AU"/>
               </w:rPr>
-              <w:t>SDA to D10, SCK to D13, MOSI to D11, MISO to D12, IRQ not connected, GND to GND, RST to D</w:t>
-            </w:r>
-            <w:proofErr w:type="gramStart"/>
-            <w:r>
-              <w:rPr>
-                <w:lang w:val="en-AU"/>
-              </w:rPr>
-              <w:t>9 ,</w:t>
-            </w:r>
-            <w:proofErr w:type="gramEnd"/>
-            <w:r>
-              <w:rPr>
-                <w:lang w:val="en-AU"/>
-              </w:rPr>
-              <w:t xml:space="preserve"> 3.3V to 3.3V</w:t>
+              <w:t>SDA to D10, SCK to D13, MOSI to D11, MISO to D12, IRQ not connected, GND to GND, RST to D9 , 3.3V to 3.3V</w:t>
             </w:r>
           </w:p>
         </w:tc>
@@ -8996,21 +8690,7 @@
               <w:rPr>
                 <w:lang w:val="en-AU"/>
               </w:rPr>
-              <w:t xml:space="preserve">Left to 5V, Right to D13, </w:t>
-            </w:r>
-            <w:proofErr w:type="gramStart"/>
-            <w:r>
-              <w:rPr>
-                <w:lang w:val="en-AU"/>
-              </w:rPr>
-              <w:t>220 ohm</w:t>
-            </w:r>
-            <w:proofErr w:type="gramEnd"/>
-            <w:r>
-              <w:rPr>
-                <w:lang w:val="en-AU"/>
-              </w:rPr>
-              <w:t xml:space="preserve"> resistor and ground. </w:t>
+              <w:t xml:space="preserve">Left to 5V, Right to D13, 220 ohm resistor and ground. </w:t>
             </w:r>
           </w:p>
         </w:tc>
@@ -9126,21 +8806,7 @@
         <w:rPr>
           <w:lang w:val="en-AU"/>
         </w:rPr>
-        <w:t xml:space="preserve">Get digital read to </w:t>
-      </w:r>
-      <w:proofErr w:type="gramStart"/>
-      <w:r>
-        <w:rPr>
-          <w:lang w:val="en-AU"/>
-        </w:rPr>
-        <w:t>detect  joystick</w:t>
-      </w:r>
-      <w:proofErr w:type="gramEnd"/>
-      <w:r>
-        <w:rPr>
-          <w:lang w:val="en-AU"/>
-        </w:rPr>
-        <w:t xml:space="preserve"> press, and digital write to turn LED on and off. </w:t>
+        <w:t xml:space="preserve">Get digital read to detect  joystick press, and digital write to turn LED on and off. </w:t>
       </w:r>
     </w:p>
     <w:p>
@@ -9187,15 +8853,7 @@
         </w:rPr>
       </w:pPr>
       <w:r>
-        <w:t xml:space="preserve">Had to check wiring due to a small issue with the Led not being pressed down </w:t>
-      </w:r>
-      <w:proofErr w:type="gramStart"/>
-      <w:r>
-        <w:t>properly .</w:t>
-      </w:r>
-      <w:proofErr w:type="gramEnd"/>
-      <w:r>
-        <w:t xml:space="preserve"> </w:t>
+        <w:t xml:space="preserve">Had to check wiring due to a small issue with the Led not being pressed down properly . </w:t>
       </w:r>
     </w:p>
     <w:p>
@@ -9288,23 +8946,7 @@
           <w:szCs w:val="48"/>
           <w:lang w:val="en-AU"/>
         </w:rPr>
-        <w:t xml:space="preserve">– </w:t>
-      </w:r>
-      <w:r>
-        <w:rPr>
-          <w:sz w:val="48"/>
-          <w:szCs w:val="48"/>
-          <w:lang w:val="en-AU"/>
-        </w:rPr>
-        <w:t>30</w:t>
-      </w:r>
-      <w:r>
-        <w:rPr>
-          <w:sz w:val="48"/>
-          <w:szCs w:val="48"/>
-          <w:lang w:val="en-AU"/>
-        </w:rPr>
-        <w:t>/06/2026</w:t>
+        <w:t>– 30/06/2026</w:t>
       </w:r>
     </w:p>
     <w:p>
@@ -9338,15 +8980,27 @@
           <w:bCs/>
           <w:lang w:val="en-AU"/>
         </w:rPr>
-        <w:t xml:space="preserve">Input: </w:t>
-      </w:r>
+        <w:t>Input: Photoresistor</w:t>
+      </w:r>
+    </w:p>
+    <w:p>
+      <w:pPr>
+        <w:pStyle w:val="ListParagraph"/>
+        <w:numPr>
+          <w:ilvl w:val="0"/>
+          <w:numId w:val="2"/>
+        </w:numPr>
+        <w:rPr>
+          <w:lang w:val="en-AU"/>
+        </w:rPr>
+      </w:pPr>
       <w:r>
         <w:rPr>
           <w:b/>
           <w:bCs/>
           <w:lang w:val="en-AU"/>
         </w:rPr>
-        <w:t>Photoresistor</w:t>
+        <w:t>Output: Speaker</w:t>
       </w:r>
     </w:p>
     <w:p>
@@ -9366,71 +9020,27 @@
           <w:bCs/>
           <w:lang w:val="en-AU"/>
         </w:rPr>
-        <w:t xml:space="preserve">Output: </w:t>
-      </w:r>
+        <w:t xml:space="preserve">Chaos: Evil wheel. </w:t>
+      </w:r>
+    </w:p>
+    <w:p>
+      <w:pPr>
+        <w:pStyle w:val="ListParagraph"/>
+        <w:numPr>
+          <w:ilvl w:val="0"/>
+          <w:numId w:val="2"/>
+        </w:numPr>
+        <w:rPr>
+          <w:lang w:val="en-AU"/>
+        </w:rPr>
+      </w:pPr>
       <w:r>
         <w:rPr>
           <w:b/>
           <w:bCs/>
           <w:lang w:val="en-AU"/>
         </w:rPr>
-        <w:t>Speaker</w:t>
-      </w:r>
-    </w:p>
-    <w:p>
-      <w:pPr>
-        <w:pStyle w:val="ListParagraph"/>
-        <w:numPr>
-          <w:ilvl w:val="0"/>
-          <w:numId w:val="2"/>
-        </w:numPr>
-        <w:rPr>
-          <w:lang w:val="en-AU"/>
-        </w:rPr>
-      </w:pPr>
-      <w:r>
-        <w:rPr>
-          <w:b/>
-          <w:bCs/>
-          <w:lang w:val="en-AU"/>
-        </w:rPr>
-        <w:t xml:space="preserve">Chaos: </w:t>
-      </w:r>
-      <w:r>
-        <w:rPr>
-          <w:b/>
-          <w:bCs/>
-          <w:lang w:val="en-AU"/>
-        </w:rPr>
-        <w:t xml:space="preserve">Evil wheel. </w:t>
-      </w:r>
-    </w:p>
-    <w:p>
-      <w:pPr>
-        <w:pStyle w:val="ListParagraph"/>
-        <w:numPr>
-          <w:ilvl w:val="0"/>
-          <w:numId w:val="2"/>
-        </w:numPr>
-        <w:rPr>
-          <w:lang w:val="en-AU"/>
-        </w:rPr>
-      </w:pPr>
-      <w:r>
-        <w:rPr>
-          <w:b/>
-          <w:bCs/>
-          <w:lang w:val="en-AU"/>
-        </w:rPr>
-        <w:t xml:space="preserve">Evil (if applicable): </w:t>
-      </w:r>
-      <w:r>
-        <w:rPr>
-          <w:b/>
-          <w:bCs/>
-          <w:lang w:val="en-AU"/>
-        </w:rPr>
-        <w:t xml:space="preserve">No while loops. </w:t>
+        <w:t xml:space="preserve">Evil (if applicable): No while loops. </w:t>
       </w:r>
     </w:p>
     <w:p>
@@ -9574,13 +9184,7 @@
               <w:rPr>
                 <w:lang w:val="en-AU"/>
               </w:rPr>
-              <w:t>L</w:t>
-            </w:r>
-            <w:r>
-              <w:rPr>
-                <w:lang w:val="en-AU"/>
-              </w:rPr>
-              <w:t>DR</w:t>
+              <w:t>LDR</w:t>
             </w:r>
           </w:p>
         </w:tc>
@@ -9680,13 +9284,7 @@
               <w:rPr>
                 <w:lang w:val="en-AU"/>
               </w:rPr>
-              <w:t>D8 is output, GND is Ground.</w:t>
-            </w:r>
-            <w:r>
-              <w:rPr>
-                <w:lang w:val="en-AU"/>
-              </w:rPr>
-              <w:t xml:space="preserve"> </w:t>
+              <w:t xml:space="preserve">D8 is output, GND is Ground. </w:t>
             </w:r>
           </w:p>
         </w:tc>
@@ -9847,25 +9445,684 @@
           <w:szCs w:val="48"/>
           <w:lang w:val="en-AU"/>
         </w:rPr>
-        <w:t xml:space="preserve">TEMPLATE </w:t>
-      </w:r>
-      <w:proofErr w:type="gramStart"/>
+        <w:t>16</w:t>
+      </w:r>
       <w:r>
         <w:rPr>
           <w:sz w:val="48"/>
           <w:szCs w:val="48"/>
           <w:lang w:val="en-AU"/>
         </w:rPr>
-        <w:t>-  XX</w:t>
-      </w:r>
-      <w:proofErr w:type="gramEnd"/>
+        <w:t xml:space="preserve"> </w:t>
+      </w:r>
       <w:r>
         <w:rPr>
           <w:sz w:val="48"/>
           <w:szCs w:val="48"/>
           <w:lang w:val="en-AU"/>
         </w:rPr>
-        <w:t>/XX/2026</w:t>
+        <w:t xml:space="preserve">– </w:t>
+      </w:r>
+      <w:r>
+        <w:rPr>
+          <w:sz w:val="48"/>
+          <w:szCs w:val="48"/>
+          <w:lang w:val="en-AU"/>
+        </w:rPr>
+        <w:t>1</w:t>
+      </w:r>
+      <w:r>
+        <w:rPr>
+          <w:sz w:val="48"/>
+          <w:szCs w:val="48"/>
+          <w:lang w:val="en-AU"/>
+        </w:rPr>
+        <w:t>/0</w:t>
+      </w:r>
+      <w:r>
+        <w:rPr>
+          <w:sz w:val="48"/>
+          <w:szCs w:val="48"/>
+          <w:lang w:val="en-AU"/>
+        </w:rPr>
+        <w:t>7</w:t>
+      </w:r>
+      <w:r>
+        <w:rPr>
+          <w:sz w:val="48"/>
+          <w:szCs w:val="48"/>
+          <w:lang w:val="en-AU"/>
+        </w:rPr>
+        <w:t>/2026</w:t>
+      </w:r>
+    </w:p>
+    <w:p>
+      <w:pPr>
+        <w:pStyle w:val="Heading3"/>
+        <w:rPr>
+          <w:lang w:val="en-AU"/>
+        </w:rPr>
+      </w:pPr>
+      <w:r>
+        <w:rPr>
+          <w:lang w:val="en-AU"/>
+        </w:rPr>
+        <w:t>Wheel Spins</w:t>
+      </w:r>
+    </w:p>
+    <w:p>
+      <w:pPr>
+        <w:pStyle w:val="ListParagraph"/>
+        <w:numPr>
+          <w:ilvl w:val="0"/>
+          <w:numId w:val="2"/>
+        </w:numPr>
+        <w:rPr>
+          <w:lang w:val="en-AU"/>
+        </w:rPr>
+      </w:pPr>
+      <w:r>
+        <w:rPr>
+          <w:b/>
+          <w:bCs/>
+          <w:lang w:val="en-AU"/>
+        </w:rPr>
+        <w:t xml:space="preserve">Input: </w:t>
+      </w:r>
+      <w:r>
+        <w:rPr>
+          <w:b/>
+          <w:bCs/>
+          <w:lang w:val="en-AU"/>
+        </w:rPr>
+        <w:t>Ultrasonic ranging module</w:t>
+      </w:r>
+    </w:p>
+    <w:p>
+      <w:pPr>
+        <w:pStyle w:val="ListParagraph"/>
+        <w:numPr>
+          <w:ilvl w:val="0"/>
+          <w:numId w:val="2"/>
+        </w:numPr>
+        <w:rPr>
+          <w:lang w:val="en-AU"/>
+        </w:rPr>
+      </w:pPr>
+      <w:r>
+        <w:rPr>
+          <w:b/>
+          <w:bCs/>
+          <w:lang w:val="en-AU"/>
+        </w:rPr>
+        <w:t xml:space="preserve">Output: </w:t>
+      </w:r>
+      <w:r>
+        <w:rPr>
+          <w:b/>
+          <w:bCs/>
+          <w:lang w:val="en-AU"/>
+        </w:rPr>
+        <w:t>LED</w:t>
+      </w:r>
+    </w:p>
+    <w:p>
+      <w:pPr>
+        <w:pStyle w:val="ListParagraph"/>
+        <w:numPr>
+          <w:ilvl w:val="0"/>
+          <w:numId w:val="2"/>
+        </w:numPr>
+        <w:rPr>
+          <w:lang w:val="en-AU"/>
+        </w:rPr>
+      </w:pPr>
+      <w:r>
+        <w:rPr>
+          <w:b/>
+          <w:bCs/>
+          <w:lang w:val="en-AU"/>
+        </w:rPr>
+        <w:t xml:space="preserve">Chaos: </w:t>
+      </w:r>
+      <w:r>
+        <w:rPr>
+          <w:b/>
+          <w:bCs/>
+          <w:lang w:val="en-AU"/>
+        </w:rPr>
+        <w:t xml:space="preserve">Quadruple Output. </w:t>
+      </w:r>
+    </w:p>
+    <w:p>
+      <w:pPr>
+        <w:pStyle w:val="ListParagraph"/>
+        <w:numPr>
+          <w:ilvl w:val="0"/>
+          <w:numId w:val="2"/>
+        </w:numPr>
+        <w:rPr>
+          <w:lang w:val="en-AU"/>
+        </w:rPr>
+      </w:pPr>
+      <w:r>
+        <w:rPr>
+          <w:b/>
+          <w:bCs/>
+          <w:lang w:val="en-AU"/>
+        </w:rPr>
+        <w:t xml:space="preserve">Evil (if applicable): </w:t>
+      </w:r>
+      <w:r>
+        <w:rPr>
+          <w:b/>
+          <w:bCs/>
+          <w:lang w:val="en-AU"/>
+        </w:rPr>
+        <w:t>N/A</w:t>
+      </w:r>
+    </w:p>
+    <w:p>
+      <w:pPr>
+        <w:pStyle w:val="Heading3"/>
+        <w:rPr>
+          <w:lang w:val="en-AU"/>
+        </w:rPr>
+      </w:pPr>
+      <w:r>
+        <w:rPr>
+          <w:lang w:val="en-AU"/>
+        </w:rPr>
+        <w:t>Objective</w:t>
+      </w:r>
+    </w:p>
+    <w:p>
+      <w:pPr>
+        <w:pStyle w:val="ListParagraph"/>
+        <w:numPr>
+          <w:ilvl w:val="0"/>
+          <w:numId w:val="2"/>
+        </w:numPr>
+        <w:rPr>
+          <w:lang w:val="en-AU"/>
+        </w:rPr>
+      </w:pPr>
+      <w:r>
+        <w:rPr>
+          <w:lang w:val="en-AU"/>
+        </w:rPr>
+        <w:t xml:space="preserve">Ultrasonic ranging module detects ranges, when it detects an object 20,15,10 and 5 m away, a new LED lights up. </w:t>
+      </w:r>
+    </w:p>
+    <w:p>
+      <w:pPr>
+        <w:pStyle w:val="Heading3"/>
+        <w:rPr>
+          <w:lang w:val="en-AU"/>
+        </w:rPr>
+      </w:pPr>
+      <w:r>
+        <w:rPr>
+          <w:lang w:val="en-AU"/>
+        </w:rPr>
+        <w:t>Circuit Diagram and Pin table</w:t>
+      </w:r>
+    </w:p>
+    <w:p>
+      <w:pPr>
+        <w:rPr>
+          <w:lang w:val="en-AU"/>
+        </w:rPr>
+      </w:pPr>
+      <w:r>
+        <w:rPr>
+          <w:lang w:val="en-AU"/>
+        </w:rPr>
+        <w:t xml:space="preserve">Potentiometer </w:t>
+      </w:r>
+    </w:p>
+    <w:tbl>
+      <w:tblPr>
+        <w:tblStyle w:val="TableGrid"/>
+        <w:tblW w:w="0" w:type="auto"/>
+        <w:tblLook w:val="04A0" w:firstRow="1" w:lastRow="0" w:firstColumn="1" w:lastColumn="0" w:noHBand="0" w:noVBand="1"/>
+      </w:tblPr>
+      <w:tblGrid>
+        <w:gridCol w:w="3005"/>
+        <w:gridCol w:w="3005"/>
+        <w:gridCol w:w="3006"/>
+      </w:tblGrid>
+      <w:tr>
+        <w:tc>
+          <w:tcPr>
+            <w:tcW w:w="3005" w:type="dxa"/>
+          </w:tcPr>
+          <w:p>
+            <w:pPr>
+              <w:rPr>
+                <w:lang w:val="en-AU"/>
+              </w:rPr>
+            </w:pPr>
+            <w:r>
+              <w:rPr>
+                <w:lang w:val="en-AU"/>
+              </w:rPr>
+              <w:t>Part</w:t>
+            </w:r>
+          </w:p>
+        </w:tc>
+        <w:tc>
+          <w:tcPr>
+            <w:tcW w:w="3005" w:type="dxa"/>
+          </w:tcPr>
+          <w:p>
+            <w:pPr>
+              <w:rPr>
+                <w:lang w:val="en-AU"/>
+              </w:rPr>
+            </w:pPr>
+            <w:r>
+              <w:rPr>
+                <w:lang w:val="en-AU"/>
+              </w:rPr>
+              <w:t>Pin Num(s)</w:t>
+            </w:r>
+          </w:p>
+        </w:tc>
+        <w:tc>
+          <w:tcPr>
+            <w:tcW w:w="3006" w:type="dxa"/>
+          </w:tcPr>
+          <w:p>
+            <w:pPr>
+              <w:rPr>
+                <w:lang w:val="en-AU"/>
+              </w:rPr>
+            </w:pPr>
+            <w:r>
+              <w:rPr>
+                <w:lang w:val="en-AU"/>
+              </w:rPr>
+              <w:t>Type</w:t>
+            </w:r>
+          </w:p>
+        </w:tc>
+      </w:tr>
+      <w:tr>
+        <w:tc>
+          <w:tcPr>
+            <w:tcW w:w="3005" w:type="dxa"/>
+          </w:tcPr>
+          <w:p>
+            <w:pPr>
+              <w:rPr>
+                <w:lang w:val="en-AU"/>
+              </w:rPr>
+            </w:pPr>
+            <w:r>
+              <w:rPr>
+                <w:lang w:val="en-AU"/>
+              </w:rPr>
+              <w:t>Ranging Module</w:t>
+            </w:r>
+          </w:p>
+        </w:tc>
+        <w:tc>
+          <w:tcPr>
+            <w:tcW w:w="3005" w:type="dxa"/>
+          </w:tcPr>
+          <w:p>
+            <w:pPr>
+              <w:rPr>
+                <w:lang w:val="en-AU"/>
+              </w:rPr>
+            </w:pPr>
+            <w:r>
+              <w:rPr>
+                <w:lang w:val="en-AU"/>
+              </w:rPr>
+              <w:t>V</w:t>
+            </w:r>
+            <w:r>
+              <w:rPr>
+                <w:lang w:val="en-AU"/>
+              </w:rPr>
+              <w:t xml:space="preserve">CC to 5V, Trig to D3, Echo to D2, GND to GND. </w:t>
+            </w:r>
+            <w:r>
+              <w:rPr>
+                <w:lang w:val="en-AU"/>
+              </w:rPr>
+              <w:t xml:space="preserve"> </w:t>
+            </w:r>
+          </w:p>
+        </w:tc>
+        <w:tc>
+          <w:tcPr>
+            <w:tcW w:w="3006" w:type="dxa"/>
+          </w:tcPr>
+          <w:p>
+            <w:pPr>
+              <w:rPr>
+                <w:lang w:val="en-AU"/>
+              </w:rPr>
+            </w:pPr>
+            <w:r>
+              <w:rPr>
+                <w:lang w:val="en-AU"/>
+              </w:rPr>
+              <w:t xml:space="preserve">VCC is power, Trig sends sound, echo listens to return of sound, GND is ground. </w:t>
+            </w:r>
+          </w:p>
+        </w:tc>
+      </w:tr>
+      <w:tr>
+        <w:tc>
+          <w:tcPr>
+            <w:tcW w:w="3005" w:type="dxa"/>
+          </w:tcPr>
+          <w:p>
+            <w:pPr>
+              <w:rPr>
+                <w:lang w:val="en-AU"/>
+              </w:rPr>
+            </w:pPr>
+            <w:r>
+              <w:rPr>
+                <w:lang w:val="en-AU"/>
+              </w:rPr>
+              <w:t>LED’s</w:t>
+            </w:r>
+          </w:p>
+        </w:tc>
+        <w:tc>
+          <w:tcPr>
+            <w:tcW w:w="3005" w:type="dxa"/>
+          </w:tcPr>
+          <w:p>
+            <w:pPr>
+              <w:rPr>
+                <w:lang w:val="en-AU"/>
+              </w:rPr>
+            </w:pPr>
+            <w:r>
+              <w:rPr>
+                <w:lang w:val="en-AU"/>
+              </w:rPr>
+              <w:t xml:space="preserve">Each to 5V on left, on right D4,5,6,7 then 220 ohms resistor then ground. </w:t>
+            </w:r>
+            <w:r>
+              <w:rPr>
+                <w:lang w:val="en-AU"/>
+              </w:rPr>
+              <w:t xml:space="preserve"> </w:t>
+            </w:r>
+          </w:p>
+        </w:tc>
+        <w:tc>
+          <w:tcPr>
+            <w:tcW w:w="3006" w:type="dxa"/>
+          </w:tcPr>
+          <w:p>
+            <w:pPr>
+              <w:rPr>
+                <w:lang w:val="en-AU"/>
+              </w:rPr>
+            </w:pPr>
+            <w:r>
+              <w:rPr>
+                <w:lang w:val="en-AU"/>
+              </w:rPr>
+              <w:t>5V is power, GND is ground, 220 is resistance for light to work, D</w:t>
+            </w:r>
+            <w:r>
+              <w:rPr>
+                <w:lang w:val="en-AU"/>
+              </w:rPr>
+              <w:t>4,5,6,7</w:t>
+            </w:r>
+            <w:r>
+              <w:rPr>
+                <w:lang w:val="en-AU"/>
+              </w:rPr>
+              <w:t xml:space="preserve"> </w:t>
+            </w:r>
+            <w:r>
+              <w:rPr>
+                <w:lang w:val="en-AU"/>
+              </w:rPr>
+              <w:t>are</w:t>
+            </w:r>
+            <w:r>
+              <w:rPr>
+                <w:lang w:val="en-AU"/>
+              </w:rPr>
+              <w:t xml:space="preserve"> input pin.   </w:t>
+            </w:r>
+          </w:p>
+        </w:tc>
+      </w:tr>
+    </w:tbl>
+    <w:p>
+      <w:pPr>
+        <w:rPr>
+          <w:lang w:val="en-AU"/>
+        </w:rPr>
+      </w:pPr>
+    </w:p>
+    <w:p>
+      <w:pPr>
+        <w:pStyle w:val="Heading3"/>
+        <w:rPr>
+          <w:lang w:val="en-AU"/>
+        </w:rPr>
+      </w:pPr>
+      <w:r>
+        <w:rPr>
+          <w:lang w:val="en-AU"/>
+        </w:rPr>
+        <w:t>Code notes</w:t>
+      </w:r>
+    </w:p>
+    <w:p>
+      <w:pPr>
+        <w:pStyle w:val="ListParagraph"/>
+        <w:numPr>
+          <w:ilvl w:val="0"/>
+          <w:numId w:val="2"/>
+        </w:numPr>
+        <w:rPr>
+          <w:lang w:val="en-AU"/>
+        </w:rPr>
+      </w:pPr>
+      <w:r>
+        <w:rPr>
+          <w:lang w:val="en-AU"/>
+        </w:rPr>
+        <w:t xml:space="preserve">Tested basic ultrasonic and LED parts first. </w:t>
+      </w:r>
+    </w:p>
+    <w:p>
+      <w:pPr>
+        <w:pStyle w:val="ListParagraph"/>
+        <w:numPr>
+          <w:ilvl w:val="0"/>
+          <w:numId w:val="2"/>
+        </w:numPr>
+        <w:rPr>
+          <w:lang w:val="en-AU"/>
+        </w:rPr>
+      </w:pPr>
+      <w:r>
+        <w:rPr>
+          <w:lang w:val="en-AU"/>
+        </w:rPr>
+        <w:t xml:space="preserve">Piggybacked off code tests to make a system that follows the objective. </w:t>
+      </w:r>
+    </w:p>
+    <w:p>
+      <w:pPr>
+        <w:pStyle w:val="Heading3"/>
+        <w:rPr>
+          <w:lang w:val="en-AU"/>
+        </w:rPr>
+      </w:pPr>
+      <w:r>
+        <w:rPr>
+          <w:lang w:val="en-AU"/>
+        </w:rPr>
+        <w:t>Problems</w:t>
+      </w:r>
+    </w:p>
+    <w:p>
+      <w:pPr>
+        <w:pStyle w:val="ListParagraph"/>
+        <w:numPr>
+          <w:ilvl w:val="0"/>
+          <w:numId w:val="2"/>
+        </w:numPr>
+      </w:pPr>
+      <w:r>
+        <w:t xml:space="preserve">Mixed echo with Trig, which caused issues. Fixed by bug fixing. </w:t>
+      </w:r>
+    </w:p>
+    <w:p>
+      <w:pPr>
+        <w:pStyle w:val="ListParagraph"/>
+        <w:numPr>
+          <w:ilvl w:val="0"/>
+          <w:numId w:val="2"/>
+        </w:numPr>
+        <w:rPr>
+          <w:lang w:val="en-AU"/>
+        </w:rPr>
+      </w:pPr>
+      <w:r>
+        <w:t xml:space="preserve">Wiring issues with LED’s but was fixed. </w:t>
+      </w:r>
+    </w:p>
+    <w:p>
+      <w:pPr>
+        <w:pStyle w:val="ListParagraph"/>
+        <w:numPr>
+          <w:ilvl w:val="0"/>
+          <w:numId w:val="2"/>
+        </w:numPr>
+        <w:rPr>
+          <w:lang w:val="en-AU"/>
+        </w:rPr>
+      </w:pPr>
+      <w:r>
+        <w:t xml:space="preserve">Linking the 2 codes together and getting the raw data from the ultrasonic sensor was buggy but was fixed. </w:t>
+      </w:r>
+    </w:p>
+    <w:p>
+      <w:pPr>
+        <w:pStyle w:val="ListParagraph"/>
+        <w:numPr>
+          <w:ilvl w:val="0"/>
+          <w:numId w:val="2"/>
+        </w:numPr>
+        <w:rPr>
+          <w:lang w:val="en-AU"/>
+        </w:rPr>
+      </w:pPr>
+      <w:r>
+        <w:t>Lights were flashing for some reason, added in duration function and cm to make system consistent and changed the Int variables, which seemed to stop flashing.</w:t>
+      </w:r>
+    </w:p>
+    <w:p>
+      <w:pPr>
+        <w:pStyle w:val="Heading3"/>
+        <w:rPr>
+          <w:lang w:val="en-AU"/>
+        </w:rPr>
+      </w:pPr>
+      <w:r>
+        <w:rPr>
+          <w:lang w:val="en-AU"/>
+        </w:rPr>
+        <w:t>Learning</w:t>
+      </w:r>
+    </w:p>
+    <w:p>
+      <w:pPr>
+        <w:pStyle w:val="ListParagraph"/>
+        <w:numPr>
+          <w:ilvl w:val="0"/>
+          <w:numId w:val="2"/>
+        </w:numPr>
+        <w:rPr>
+          <w:lang w:val="en-AU"/>
+        </w:rPr>
+      </w:pPr>
+      <w:r>
+        <w:rPr>
+          <w:lang w:val="en-AU"/>
+        </w:rPr>
+        <w:t>Learnt groundworks of ultrasonic component</w:t>
+      </w:r>
+    </w:p>
+    <w:p>
+      <w:pPr>
+        <w:pStyle w:val="ListParagraph"/>
+        <w:numPr>
+          <w:ilvl w:val="0"/>
+          <w:numId w:val="2"/>
+        </w:numPr>
+        <w:rPr>
+          <w:lang w:val="en-AU"/>
+        </w:rPr>
+      </w:pPr>
+      <w:r>
+        <w:rPr>
+          <w:lang w:val="en-AU"/>
+        </w:rPr>
+        <w:t>Learnt how to wire more than 1 LED in sequence.</w:t>
+      </w:r>
+    </w:p>
+    <w:p>
+      <w:pPr>
+        <w:pStyle w:val="ListParagraph"/>
+        <w:numPr>
+          <w:ilvl w:val="0"/>
+          <w:numId w:val="2"/>
+        </w:numPr>
+        <w:rPr>
+          <w:lang w:val="en-AU"/>
+        </w:rPr>
+      </w:pPr>
+      <w:r>
+        <w:rPr>
+          <w:lang w:val="en-AU"/>
+        </w:rPr>
+        <w:t xml:space="preserve">Learnt how to convert sensor to work in cm. </w:t>
+      </w:r>
+    </w:p>
+    <w:p>
+      <w:pPr>
+        <w:pStyle w:val="Heading1"/>
+        <w:rPr>
+          <w:sz w:val="48"/>
+          <w:szCs w:val="48"/>
+        </w:rPr>
+      </w:pPr>
+      <w:r>
+        <w:rPr>
+          <w:sz w:val="48"/>
+          <w:szCs w:val="48"/>
+          <w:lang w:val="en-AU"/>
+        </w:rPr>
+        <w:lastRenderedPageBreak/>
+        <w:t xml:space="preserve">Day </w:t>
+      </w:r>
+      <w:r>
+        <w:rPr>
+          <w:sz w:val="48"/>
+          <w:szCs w:val="48"/>
+          <w:lang w:val="en-AU"/>
+        </w:rPr>
+        <w:t>TEMPLATE -  XX/XX/2026</w:t>
       </w:r>
     </w:p>
     <w:p>

</xml_diff>